<commit_message>
Mirror the approved Arabic trims and corrections into the English edition
The Arabic edition was reviewed and approved as the reference; this
brings the English to structural parity — the block sequence of
paragraphs, tables and figures is now identical between the two.

Same cuts: the timing table becomes a sentence, the 5.3 summary and 5.4
averages tables merge, Wilson intervals drop to four rows, the 5.2
table loses its derived and off-argument columns, the augmentation row
leaves 3.1, and the multi-paragraph stretches in 5.1, 9, 10 and 11 fold
together. Same corrections: "byte-identical output" is restated at its
measured limits and replaced by the routing-as-correctness argument,
and "every weakness is data scarcity" becomes sample shortfall, part
scarcity and part split artefact.

Co-Authored-By: Claude Fable 5 <noreply@anthropic.com>
Claude-Session: https://claude.ai/code/session_012XpwBQVzqbnTeSceeR5m1B
</commit_message>
<xml_diff>
--- a/docs/report/out/Aystro_Research_Report_EN.docx
+++ b/docs/report/out/Aystro_Research_Report_EN.docx
@@ -271,7 +271,7 @@
           <w:sz w:val="22"/>
           <w:szCs w:val="22"/>
         </w:rPr>
-        <w:t>The computational complexity of the variant-classification layer was also reduced from O(N×K) to O(N) by introducing conditional routing, measured directly as a 65% reduction in processing time with byte-identical output. The marginal cost of adding a new brand to the catalogue is approximately four minutes of GPU time, measured four separate times. The unifying result is that every measured weakness in the system traces to a specific, countable data-supply gap rather than to any deficiency in the architecture or the choice of model.</w:t>
+        <w:t>The computational complexity of the variant-classification layer was also reduced from O(N×K) to O(N) by introducing conditional routing, measured directly as a 65% reduction in processing time with identical labels on the measured photograph. The marginal cost of adding a new brand to the catalogue is approximately four minutes of GPU time, measured four separate times. The unifying result is that every measured weakness in the system traces to a specific, countable sample shortfall — genuine data scarcity in some cases, a test-split artefact in others — rather than to any deficiency in the architecture or the choice of model.</w:t>
       </w:r>
     </w:p>
     <w:p>
@@ -1119,77 +1119,6 @@
           </w:p>
         </w:tc>
       </w:tr>
-      <w:tr>
-        <w:tc>
-          <w:tcPr>
-            <w:tcW w:type="dxa" w:w="2986"/>
-          </w:tcPr>
-          <w:p>
-            <w:pPr>
-              <w:spacing w:before="60" w:after="60"/>
-              <w:jc w:val="left"/>
-            </w:pPr>
-            <w:r/>
-            <w:r>
-              <w:rPr>
-                <w:rFonts w:ascii="Times New Roman" w:hAnsi="Times New Roman" w:cs="Times New Roman"/>
-                <w:b w:val="0"/>
-                <w:i w:val="0"/>
-                <w:color w:val="111111"/>
-                <w:sz w:val="20"/>
-                <w:szCs w:val="20"/>
-              </w:rPr>
-              <w:t>Augmentation</w:t>
-            </w:r>
-          </w:p>
-        </w:tc>
-        <w:tc>
-          <w:tcPr>
-            <w:tcW w:type="dxa" w:w="2986"/>
-          </w:tcPr>
-          <w:p>
-            <w:pPr>
-              <w:spacing w:before="60" w:after="60"/>
-              <w:jc w:val="left"/>
-            </w:pPr>
-            <w:r/>
-            <w:r>
-              <w:rPr>
-                <w:rFonts w:ascii="Times New Roman" w:hAnsi="Times New Roman" w:cs="Times New Roman"/>
-                <w:b w:val="0"/>
-                <w:i w:val="0"/>
-                <w:color w:val="111111"/>
-                <w:sz w:val="20"/>
-                <w:szCs w:val="20"/>
-              </w:rPr>
-              <w:t>horizontal flip, 15° rotation</w:t>
-            </w:r>
-          </w:p>
-        </w:tc>
-        <w:tc>
-          <w:tcPr>
-            <w:tcW w:type="dxa" w:w="2986"/>
-          </w:tcPr>
-          <w:p>
-            <w:pPr>
-              <w:spacing w:before="60" w:after="60"/>
-              <w:jc w:val="left"/>
-            </w:pPr>
-            <w:r/>
-            <w:r>
-              <w:rPr>
-                <w:rFonts w:ascii="Times New Roman" w:hAnsi="Times New Roman" w:cs="Times New Roman"/>
-                <w:b w:val="0"/>
-                <w:i w:val="0"/>
-                <w:color w:val="111111"/>
-                <w:sz w:val="20"/>
-                <w:szCs w:val="20"/>
-              </w:rPr>
-              <w:t>blur, exposure</w:t>
-            </w:r>
-          </w:p>
-        </w:tc>
-      </w:tr>
     </w:tbl>
     <w:p>
       <w:pPr>
@@ -1611,25 +1540,7 @@
           <w:sz w:val="23"/>
           <w:szCs w:val="23"/>
         </w:rPr>
-        <w:t>The accuracy of any classification system is measured at a declared confidence threshold: the model emits a confidence score with every prediction, and the prediction counts only if that score exceeds an agreed threshold. This study adopts a single fixed threshold of 0.70 for every classification figure it reports — for both detectors and all six classifiers.</w:t>
-      </w:r>
-    </w:p>
-    <w:p>
-      <w:pPr>
-        <w:keepNext w:val="0"/>
-        <w:spacing w:after="160" w:before="0" w:line="348" w:lineRule="auto"/>
-        <w:jc w:val="both"/>
-      </w:pPr>
-      <w:r>
-        <w:rPr>
-          <w:rFonts w:ascii="Times New Roman" w:hAnsi="Times New Roman" w:cs="Times New Roman"/>
-          <w:b w:val="0"/>
-          <w:i w:val="0"/>
-          <w:color w:val="111111"/>
-          <w:sz w:val="23"/>
-          <w:szCs w:val="23"/>
-        </w:rPr>
-        <w:t>This choice is methodological, not cosmetic. The evaluation tool computes for each class its own “optimal threshold”, the point at which that class performs best; here those range from zero to 0.91 depending on the class. Reporting each class at its own threshold yields high numbers but does not describe a single system, because a running system cannot apply a different threshold to each class simultaneously. A single fixed threshold describes what actually happens when the pipeline runs as one unit, and it is the stricter choice — the figures below are lower than their optimal-threshold counterparts, deliberately.</w:t>
+        <w:t>The accuracy of any classification system is measured at a declared confidence threshold, and this study adopts a single fixed threshold of 0.70 for every classification figure it reports — for both detectors and all six classifiers. The choice is methodological, not cosmetic: the evaluation tool computes for each class its own “optimal threshold” (ranging here from zero to 0.91), and reporting each class at its own threshold yields high numbers that describe no single system, since a running pipeline cannot apply a different threshold per class. The fixed threshold describes what actually happens when the system runs as one unit, and it is the stricter choice — the figures below are lower than their optimal-threshold counterparts, deliberately.</w:t>
       </w:r>
     </w:p>
     <w:p>
@@ -2534,7 +2445,7 @@
           <w:sz w:val="19"/>
           <w:szCs w:val="19"/>
         </w:rPr>
-        <w:t>Per-class performance of the single-layer detector (0.70 threshold) against each class's share of the annotation budget. Total: 4,879 annotations.</w:t>
+        <w:t>Per-class performance of the single-layer detector against each class's share of the annotation budget. Total: 4,879 annotations.</w:t>
       </w:r>
     </w:p>
     <w:tbl>
@@ -2545,17 +2456,14 @@
         <w:tblLook w:firstColumn="1" w:firstRow="1" w:lastColumn="0" w:lastRow="0" w:noHBand="0" w:noVBand="1" w:val="04A0"/>
       </w:tblPr>
       <w:tblGrid>
-        <w:gridCol w:w="1493"/>
-        <w:gridCol w:w="1493"/>
-        <w:gridCol w:w="1493"/>
-        <w:gridCol w:w="1493"/>
-        <w:gridCol w:w="1493"/>
-        <w:gridCol w:w="1493"/>
+        <w:gridCol w:w="2986"/>
+        <w:gridCol w:w="2986"/>
+        <w:gridCol w:w="2986"/>
       </w:tblGrid>
       <w:tr>
         <w:tc>
           <w:tcPr>
-            <w:tcW w:type="dxa" w:w="1493"/>
+            <w:tcW w:type="dxa" w:w="2986"/>
           </w:tcPr>
           <w:p>
             <w:pPr>
@@ -2579,7 +2487,7 @@
         </w:tc>
         <w:tc>
           <w:tcPr>
-            <w:tcW w:type="dxa" w:w="1493"/>
+            <w:tcW w:type="dxa" w:w="2986"/>
           </w:tcPr>
           <w:p>
             <w:pPr>
@@ -2603,31 +2511,7 @@
         </w:tc>
         <w:tc>
           <w:tcPr>
-            <w:tcW w:type="dxa" w:w="1493"/>
-          </w:tcPr>
-          <w:p>
-            <w:pPr>
-              <w:spacing w:before="60" w:after="60"/>
-              <w:jc w:val="left"/>
-            </w:pPr>
-            <w:r/>
-            <w:r>
-              <w:rPr>
-                <w:rFonts w:ascii="Times New Roman" w:hAnsi="Times New Roman" w:cs="Times New Roman"/>
-                <w:b/>
-                <w:bCs w:val="1"/>
-                <w:i w:val="0"/>
-                <w:color w:val="111111"/>
-                <w:sz w:val="20"/>
-                <w:szCs w:val="20"/>
-              </w:rPr>
-              <w:t>Share</w:t>
-            </w:r>
-          </w:p>
-        </w:tc>
-        <w:tc>
-          <w:tcPr>
-            <w:tcW w:type="dxa" w:w="1493"/>
+            <w:tcW w:type="dxa" w:w="2986"/>
           </w:tcPr>
           <w:p>
             <w:pPr>
@@ -2649,59 +2533,11 @@
             </w:r>
           </w:p>
         </w:tc>
-        <w:tc>
-          <w:tcPr>
-            <w:tcW w:type="dxa" w:w="1493"/>
-          </w:tcPr>
-          <w:p>
-            <w:pPr>
-              <w:spacing w:before="60" w:after="60"/>
-              <w:jc w:val="left"/>
-            </w:pPr>
-            <w:r/>
-            <w:r>
-              <w:rPr>
-                <w:rFonts w:ascii="Times New Roman" w:hAnsi="Times New Roman" w:cs="Times New Roman"/>
-                <w:b/>
-                <w:bCs w:val="1"/>
-                <w:i w:val="0"/>
-                <w:color w:val="111111"/>
-                <w:sz w:val="20"/>
-                <w:szCs w:val="20"/>
-              </w:rPr>
-              <w:t>Precision</w:t>
-            </w:r>
-          </w:p>
-        </w:tc>
-        <w:tc>
-          <w:tcPr>
-            <w:tcW w:type="dxa" w:w="1493"/>
-          </w:tcPr>
-          <w:p>
-            <w:pPr>
-              <w:spacing w:before="60" w:after="60"/>
-              <w:jc w:val="left"/>
-            </w:pPr>
-            <w:r/>
-            <w:r>
-              <w:rPr>
-                <w:rFonts w:ascii="Times New Roman" w:hAnsi="Times New Roman" w:cs="Times New Roman"/>
-                <w:b/>
-                <w:bCs w:val="1"/>
-                <w:i w:val="0"/>
-                <w:color w:val="111111"/>
-                <w:sz w:val="20"/>
-                <w:szCs w:val="20"/>
-              </w:rPr>
-              <w:t>Recall</w:t>
-            </w:r>
-          </w:p>
-        </w:tc>
       </w:tr>
       <w:tr>
         <w:tc>
           <w:tcPr>
-            <w:tcW w:type="dxa" w:w="1493"/>
+            <w:tcW w:type="dxa" w:w="2986"/>
           </w:tcPr>
           <w:p>
             <w:pPr>
@@ -2724,7 +2560,7 @@
         </w:tc>
         <w:tc>
           <w:tcPr>
-            <w:tcW w:type="dxa" w:w="1493"/>
+            <w:tcW w:type="dxa" w:w="2986"/>
           </w:tcPr>
           <w:p>
             <w:pPr>
@@ -2747,30 +2583,7 @@
         </w:tc>
         <w:tc>
           <w:tcPr>
-            <w:tcW w:type="dxa" w:w="1493"/>
-          </w:tcPr>
-          <w:p>
-            <w:pPr>
-              <w:spacing w:before="60" w:after="60"/>
-              <w:jc w:val="left"/>
-            </w:pPr>
-            <w:r/>
-            <w:r>
-              <w:rPr>
-                <w:rFonts w:ascii="Times New Roman" w:hAnsi="Times New Roman" w:cs="Times New Roman"/>
-                <w:b w:val="0"/>
-                <w:i w:val="0"/>
-                <w:color w:val="111111"/>
-                <w:sz w:val="20"/>
-                <w:szCs w:val="20"/>
-              </w:rPr>
-              <w:t>42.6%</w:t>
-            </w:r>
-          </w:p>
-        </w:tc>
-        <w:tc>
-          <w:tcPr>
-            <w:tcW w:type="dxa" w:w="1493"/>
+            <w:tcW w:type="dxa" w:w="2986"/>
           </w:tcPr>
           <w:p>
             <w:pPr>
@@ -2791,57 +2604,11 @@
             </w:r>
           </w:p>
         </w:tc>
-        <w:tc>
-          <w:tcPr>
-            <w:tcW w:type="dxa" w:w="1493"/>
-          </w:tcPr>
-          <w:p>
-            <w:pPr>
-              <w:spacing w:before="60" w:after="60"/>
-              <w:jc w:val="left"/>
-            </w:pPr>
-            <w:r/>
-            <w:r>
-              <w:rPr>
-                <w:rFonts w:ascii="Times New Roman" w:hAnsi="Times New Roman" w:cs="Times New Roman"/>
-                <w:b w:val="0"/>
-                <w:i w:val="0"/>
-                <w:color w:val="111111"/>
-                <w:sz w:val="20"/>
-                <w:szCs w:val="20"/>
-              </w:rPr>
-              <w:t>96.1%</w:t>
-            </w:r>
-          </w:p>
-        </w:tc>
-        <w:tc>
-          <w:tcPr>
-            <w:tcW w:type="dxa" w:w="1493"/>
-          </w:tcPr>
-          <w:p>
-            <w:pPr>
-              <w:spacing w:before="60" w:after="60"/>
-              <w:jc w:val="left"/>
-            </w:pPr>
-            <w:r/>
-            <w:r>
-              <w:rPr>
-                <w:rFonts w:ascii="Times New Roman" w:hAnsi="Times New Roman" w:cs="Times New Roman"/>
-                <w:b w:val="0"/>
-                <w:i w:val="0"/>
-                <w:color w:val="111111"/>
-                <w:sz w:val="20"/>
-                <w:szCs w:val="20"/>
-              </w:rPr>
-              <w:t>71.3%</w:t>
-            </w:r>
-          </w:p>
-        </w:tc>
       </w:tr>
       <w:tr>
         <w:tc>
           <w:tcPr>
-            <w:tcW w:type="dxa" w:w="1493"/>
+            <w:tcW w:type="dxa" w:w="2986"/>
           </w:tcPr>
           <w:p>
             <w:pPr>
@@ -2864,7 +2631,7 @@
         </w:tc>
         <w:tc>
           <w:tcPr>
-            <w:tcW w:type="dxa" w:w="1493"/>
+            <w:tcW w:type="dxa" w:w="2986"/>
           </w:tcPr>
           <w:p>
             <w:pPr>
@@ -2887,30 +2654,7 @@
         </w:tc>
         <w:tc>
           <w:tcPr>
-            <w:tcW w:type="dxa" w:w="1493"/>
-          </w:tcPr>
-          <w:p>
-            <w:pPr>
-              <w:spacing w:before="60" w:after="60"/>
-              <w:jc w:val="left"/>
-            </w:pPr>
-            <w:r/>
-            <w:r>
-              <w:rPr>
-                <w:rFonts w:ascii="Times New Roman" w:hAnsi="Times New Roman" w:cs="Times New Roman"/>
-                <w:b w:val="0"/>
-                <w:i w:val="0"/>
-                <w:color w:val="111111"/>
-                <w:sz w:val="20"/>
-                <w:szCs w:val="20"/>
-              </w:rPr>
-              <w:t>19.4%</w:t>
-            </w:r>
-          </w:p>
-        </w:tc>
-        <w:tc>
-          <w:tcPr>
-            <w:tcW w:type="dxa" w:w="1493"/>
+            <w:tcW w:type="dxa" w:w="2986"/>
           </w:tcPr>
           <w:p>
             <w:pPr>
@@ -2931,57 +2675,11 @@
             </w:r>
           </w:p>
         </w:tc>
-        <w:tc>
-          <w:tcPr>
-            <w:tcW w:type="dxa" w:w="1493"/>
-          </w:tcPr>
-          <w:p>
-            <w:pPr>
-              <w:spacing w:before="60" w:after="60"/>
-              <w:jc w:val="left"/>
-            </w:pPr>
-            <w:r/>
-            <w:r>
-              <w:rPr>
-                <w:rFonts w:ascii="Times New Roman" w:hAnsi="Times New Roman" w:cs="Times New Roman"/>
-                <w:b w:val="0"/>
-                <w:i w:val="0"/>
-                <w:color w:val="111111"/>
-                <w:sz w:val="20"/>
-                <w:szCs w:val="20"/>
-              </w:rPr>
-              <w:t>89.4%</w:t>
-            </w:r>
-          </w:p>
-        </w:tc>
-        <w:tc>
-          <w:tcPr>
-            <w:tcW w:type="dxa" w:w="1493"/>
-          </w:tcPr>
-          <w:p>
-            <w:pPr>
-              <w:spacing w:before="60" w:after="60"/>
-              <w:jc w:val="left"/>
-            </w:pPr>
-            <w:r/>
-            <w:r>
-              <w:rPr>
-                <w:rFonts w:ascii="Times New Roman" w:hAnsi="Times New Roman" w:cs="Times New Roman"/>
-                <w:b w:val="0"/>
-                <w:i w:val="0"/>
-                <w:color w:val="111111"/>
-                <w:sz w:val="20"/>
-                <w:szCs w:val="20"/>
-              </w:rPr>
-              <w:t>75.0%</w:t>
-            </w:r>
-          </w:p>
-        </w:tc>
       </w:tr>
       <w:tr>
         <w:tc>
           <w:tcPr>
-            <w:tcW w:type="dxa" w:w="1493"/>
+            <w:tcW w:type="dxa" w:w="2986"/>
           </w:tcPr>
           <w:p>
             <w:pPr>
@@ -3004,7 +2702,7 @@
         </w:tc>
         <w:tc>
           <w:tcPr>
-            <w:tcW w:type="dxa" w:w="1493"/>
+            <w:tcW w:type="dxa" w:w="2986"/>
           </w:tcPr>
           <w:p>
             <w:pPr>
@@ -3027,30 +2725,7 @@
         </w:tc>
         <w:tc>
           <w:tcPr>
-            <w:tcW w:type="dxa" w:w="1493"/>
-          </w:tcPr>
-          <w:p>
-            <w:pPr>
-              <w:spacing w:before="60" w:after="60"/>
-              <w:jc w:val="left"/>
-            </w:pPr>
-            <w:r/>
-            <w:r>
-              <w:rPr>
-                <w:rFonts w:ascii="Times New Roman" w:hAnsi="Times New Roman" w:cs="Times New Roman"/>
-                <w:b w:val="0"/>
-                <w:i w:val="0"/>
-                <w:color w:val="111111"/>
-                <w:sz w:val="20"/>
-                <w:szCs w:val="20"/>
-              </w:rPr>
-              <w:t>13.5%</w:t>
-            </w:r>
-          </w:p>
-        </w:tc>
-        <w:tc>
-          <w:tcPr>
-            <w:tcW w:type="dxa" w:w="1493"/>
+            <w:tcW w:type="dxa" w:w="2986"/>
           </w:tcPr>
           <w:p>
             <w:pPr>
@@ -3071,57 +2746,11 @@
             </w:r>
           </w:p>
         </w:tc>
-        <w:tc>
-          <w:tcPr>
-            <w:tcW w:type="dxa" w:w="1493"/>
-          </w:tcPr>
-          <w:p>
-            <w:pPr>
-              <w:spacing w:before="60" w:after="60"/>
-              <w:jc w:val="left"/>
-            </w:pPr>
-            <w:r/>
-            <w:r>
-              <w:rPr>
-                <w:rFonts w:ascii="Times New Roman" w:hAnsi="Times New Roman" w:cs="Times New Roman"/>
-                <w:b w:val="0"/>
-                <w:i w:val="0"/>
-                <w:color w:val="111111"/>
-                <w:sz w:val="20"/>
-                <w:szCs w:val="20"/>
-              </w:rPr>
-              <w:t>96.9%</w:t>
-            </w:r>
-          </w:p>
-        </w:tc>
-        <w:tc>
-          <w:tcPr>
-            <w:tcW w:type="dxa" w:w="1493"/>
-          </w:tcPr>
-          <w:p>
-            <w:pPr>
-              <w:spacing w:before="60" w:after="60"/>
-              <w:jc w:val="left"/>
-            </w:pPr>
-            <w:r/>
-            <w:r>
-              <w:rPr>
-                <w:rFonts w:ascii="Times New Roman" w:hAnsi="Times New Roman" w:cs="Times New Roman"/>
-                <w:b w:val="0"/>
-                <w:i w:val="0"/>
-                <w:color w:val="111111"/>
-                <w:sz w:val="20"/>
-                <w:szCs w:val="20"/>
-              </w:rPr>
-              <w:t>66.0%</w:t>
-            </w:r>
-          </w:p>
-        </w:tc>
       </w:tr>
       <w:tr>
         <w:tc>
           <w:tcPr>
-            <w:tcW w:type="dxa" w:w="1493"/>
+            <w:tcW w:type="dxa" w:w="2986"/>
           </w:tcPr>
           <w:p>
             <w:pPr>
@@ -3144,7 +2773,7 @@
         </w:tc>
         <w:tc>
           <w:tcPr>
-            <w:tcW w:type="dxa" w:w="1493"/>
+            <w:tcW w:type="dxa" w:w="2986"/>
           </w:tcPr>
           <w:p>
             <w:pPr>
@@ -3167,30 +2796,7 @@
         </w:tc>
         <w:tc>
           <w:tcPr>
-            <w:tcW w:type="dxa" w:w="1493"/>
-          </w:tcPr>
-          <w:p>
-            <w:pPr>
-              <w:spacing w:before="60" w:after="60"/>
-              <w:jc w:val="left"/>
-            </w:pPr>
-            <w:r/>
-            <w:r>
-              <w:rPr>
-                <w:rFonts w:ascii="Times New Roman" w:hAnsi="Times New Roman" w:cs="Times New Roman"/>
-                <w:b w:val="0"/>
-                <w:i w:val="0"/>
-                <w:color w:val="111111"/>
-                <w:sz w:val="20"/>
-                <w:szCs w:val="20"/>
-              </w:rPr>
-              <w:t>13.3%</w:t>
-            </w:r>
-          </w:p>
-        </w:tc>
-        <w:tc>
-          <w:tcPr>
-            <w:tcW w:type="dxa" w:w="1493"/>
+            <w:tcW w:type="dxa" w:w="2986"/>
           </w:tcPr>
           <w:p>
             <w:pPr>
@@ -3211,57 +2817,11 @@
             </w:r>
           </w:p>
         </w:tc>
-        <w:tc>
-          <w:tcPr>
-            <w:tcW w:type="dxa" w:w="1493"/>
-          </w:tcPr>
-          <w:p>
-            <w:pPr>
-              <w:spacing w:before="60" w:after="60"/>
-              <w:jc w:val="left"/>
-            </w:pPr>
-            <w:r/>
-            <w:r>
-              <w:rPr>
-                <w:rFonts w:ascii="Times New Roman" w:hAnsi="Times New Roman" w:cs="Times New Roman"/>
-                <w:b w:val="0"/>
-                <w:i w:val="0"/>
-                <w:color w:val="111111"/>
-                <w:sz w:val="20"/>
-                <w:szCs w:val="20"/>
-              </w:rPr>
-              <w:t>87.9%</w:t>
-            </w:r>
-          </w:p>
-        </w:tc>
-        <w:tc>
-          <w:tcPr>
-            <w:tcW w:type="dxa" w:w="1493"/>
-          </w:tcPr>
-          <w:p>
-            <w:pPr>
-              <w:spacing w:before="60" w:after="60"/>
-              <w:jc w:val="left"/>
-            </w:pPr>
-            <w:r/>
-            <w:r>
-              <w:rPr>
-                <w:rFonts w:ascii="Times New Roman" w:hAnsi="Times New Roman" w:cs="Times New Roman"/>
-                <w:b w:val="0"/>
-                <w:i w:val="0"/>
-                <w:color w:val="111111"/>
-                <w:sz w:val="20"/>
-                <w:szCs w:val="20"/>
-              </w:rPr>
-              <w:t>78.5%</w:t>
-            </w:r>
-          </w:p>
-        </w:tc>
       </w:tr>
       <w:tr>
         <w:tc>
           <w:tcPr>
-            <w:tcW w:type="dxa" w:w="1493"/>
+            <w:tcW w:type="dxa" w:w="2986"/>
           </w:tcPr>
           <w:p>
             <w:pPr>
@@ -3284,7 +2844,7 @@
         </w:tc>
         <w:tc>
           <w:tcPr>
-            <w:tcW w:type="dxa" w:w="1493"/>
+            <w:tcW w:type="dxa" w:w="2986"/>
           </w:tcPr>
           <w:p>
             <w:pPr>
@@ -3307,30 +2867,7 @@
         </w:tc>
         <w:tc>
           <w:tcPr>
-            <w:tcW w:type="dxa" w:w="1493"/>
-          </w:tcPr>
-          <w:p>
-            <w:pPr>
-              <w:spacing w:before="60" w:after="60"/>
-              <w:jc w:val="left"/>
-            </w:pPr>
-            <w:r/>
-            <w:r>
-              <w:rPr>
-                <w:rFonts w:ascii="Times New Roman" w:hAnsi="Times New Roman" w:cs="Times New Roman"/>
-                <w:b w:val="0"/>
-                <w:i w:val="0"/>
-                <w:color w:val="111111"/>
-                <w:sz w:val="20"/>
-                <w:szCs w:val="20"/>
-              </w:rPr>
-              <w:t>8.4%</w:t>
-            </w:r>
-          </w:p>
-        </w:tc>
-        <w:tc>
-          <w:tcPr>
-            <w:tcW w:type="dxa" w:w="1493"/>
+            <w:tcW w:type="dxa" w:w="2986"/>
           </w:tcPr>
           <w:p>
             <w:pPr>
@@ -3351,57 +2888,11 @@
             </w:r>
           </w:p>
         </w:tc>
-        <w:tc>
-          <w:tcPr>
-            <w:tcW w:type="dxa" w:w="1493"/>
-          </w:tcPr>
-          <w:p>
-            <w:pPr>
-              <w:spacing w:before="60" w:after="60"/>
-              <w:jc w:val="left"/>
-            </w:pPr>
-            <w:r/>
-            <w:r>
-              <w:rPr>
-                <w:rFonts w:ascii="Times New Roman" w:hAnsi="Times New Roman" w:cs="Times New Roman"/>
-                <w:b w:val="0"/>
-                <w:i w:val="0"/>
-                <w:color w:val="111111"/>
-                <w:sz w:val="20"/>
-                <w:szCs w:val="20"/>
-              </w:rPr>
-              <w:t>87.5%</w:t>
-            </w:r>
-          </w:p>
-        </w:tc>
-        <w:tc>
-          <w:tcPr>
-            <w:tcW w:type="dxa" w:w="1493"/>
-          </w:tcPr>
-          <w:p>
-            <w:pPr>
-              <w:spacing w:before="60" w:after="60"/>
-              <w:jc w:val="left"/>
-            </w:pPr>
-            <w:r/>
-            <w:r>
-              <w:rPr>
-                <w:rFonts w:ascii="Times New Roman" w:hAnsi="Times New Roman" w:cs="Times New Roman"/>
-                <w:b w:val="0"/>
-                <w:i w:val="0"/>
-                <w:color w:val="111111"/>
-                <w:sz w:val="20"/>
-                <w:szCs w:val="20"/>
-              </w:rPr>
-              <w:t>79.0%</w:t>
-            </w:r>
-          </w:p>
-        </w:tc>
       </w:tr>
       <w:tr>
         <w:tc>
           <w:tcPr>
-            <w:tcW w:type="dxa" w:w="1493"/>
+            <w:tcW w:type="dxa" w:w="2986"/>
           </w:tcPr>
           <w:p>
             <w:pPr>
@@ -3424,7 +2915,7 @@
         </w:tc>
         <w:tc>
           <w:tcPr>
-            <w:tcW w:type="dxa" w:w="1493"/>
+            <w:tcW w:type="dxa" w:w="2986"/>
           </w:tcPr>
           <w:p>
             <w:pPr>
@@ -3447,7 +2938,7 @@
         </w:tc>
         <w:tc>
           <w:tcPr>
-            <w:tcW w:type="dxa" w:w="1493"/>
+            <w:tcW w:type="dxa" w:w="2986"/>
           </w:tcPr>
           <w:p>
             <w:pPr>
@@ -3464,76 +2955,7 @@
                 <w:sz w:val="20"/>
                 <w:szCs w:val="20"/>
               </w:rPr>
-              <w:t>2.7%</w:t>
-            </w:r>
-          </w:p>
-        </w:tc>
-        <w:tc>
-          <w:tcPr>
-            <w:tcW w:type="dxa" w:w="1493"/>
-          </w:tcPr>
-          <w:p>
-            <w:pPr>
-              <w:spacing w:before="60" w:after="60"/>
-              <w:jc w:val="left"/>
-            </w:pPr>
-            <w:r/>
-            <w:r>
-              <w:rPr>
-                <w:rFonts w:ascii="Times New Roman" w:hAnsi="Times New Roman" w:cs="Times New Roman"/>
-                <w:b w:val="0"/>
-                <w:i w:val="0"/>
-                <w:color w:val="111111"/>
-                <w:sz w:val="20"/>
-                <w:szCs w:val="20"/>
-              </w:rPr>
-              <w:t>—</w:t>
-            </w:r>
-          </w:p>
-        </w:tc>
-        <w:tc>
-          <w:tcPr>
-            <w:tcW w:type="dxa" w:w="1493"/>
-          </w:tcPr>
-          <w:p>
-            <w:pPr>
-              <w:spacing w:before="60" w:after="60"/>
-              <w:jc w:val="left"/>
-            </w:pPr>
-            <w:r/>
-            <w:r>
-              <w:rPr>
-                <w:rFonts w:ascii="Times New Roman" w:hAnsi="Times New Roman" w:cs="Times New Roman"/>
-                <w:b w:val="0"/>
-                <w:i w:val="0"/>
-                <w:color w:val="111111"/>
-                <w:sz w:val="20"/>
-                <w:szCs w:val="20"/>
-              </w:rPr>
-              <w:t>0%</w:t>
-            </w:r>
-          </w:p>
-        </w:tc>
-        <w:tc>
-          <w:tcPr>
-            <w:tcW w:type="dxa" w:w="1493"/>
-          </w:tcPr>
-          <w:p>
-            <w:pPr>
-              <w:spacing w:before="60" w:after="60"/>
-              <w:jc w:val="left"/>
-            </w:pPr>
-            <w:r/>
-            <w:r>
-              <w:rPr>
-                <w:rFonts w:ascii="Times New Roman" w:hAnsi="Times New Roman" w:cs="Times New Roman"/>
-                <w:b w:val="0"/>
-                <w:i w:val="0"/>
-                <w:color w:val="111111"/>
-                <w:sz w:val="20"/>
-                <w:szCs w:val="20"/>
-              </w:rPr>
-              <w:t>0%</w:t>
+              <w:t>— (0% at every threshold)</w:t>
             </w:r>
           </w:p>
         </w:tc>
@@ -3734,7 +3156,7 @@
           <w:sz w:val="19"/>
           <w:szCs w:val="19"/>
         </w:rPr>
-        <w:t>Overall performance of the six classification layers at a 0.70 threshold, in descending order.</w:t>
+        <w:t>The six classification layers at a 0.70 threshold. The per-class average weighs every class equally, the per-instance average weighs every test instance equally; what the difference means is discussed in Section 5.4.</w:t>
       </w:r>
     </w:p>
     <w:tbl>
@@ -3819,7 +3241,7 @@
                 <w:sz w:val="20"/>
                 <w:szCs w:val="20"/>
               </w:rPr>
-              <w:t>Recall</w:t>
+              <w:t>Recall (per-class avg)</w:t>
             </w:r>
           </w:p>
         </w:tc>
@@ -3843,7 +3265,7 @@
                 <w:sz w:val="20"/>
                 <w:szCs w:val="20"/>
               </w:rPr>
-              <w:t>F1</w:t>
+              <w:t>Recall (per-instance avg)</w:t>
             </w:r>
           </w:p>
         </w:tc>
@@ -3937,7 +3359,7 @@
                 <w:sz w:val="20"/>
                 <w:szCs w:val="20"/>
               </w:rPr>
-              <w:t>94.0%</w:t>
+              <w:t>83.0% (39/47)</w:t>
             </w:r>
           </w:p>
         </w:tc>
@@ -4031,7 +3453,7 @@
                 <w:sz w:val="20"/>
                 <w:szCs w:val="20"/>
               </w:rPr>
-              <w:t>93.3%</w:t>
+              <w:t>94.4% (17/18)</w:t>
             </w:r>
           </w:p>
         </w:tc>
@@ -4125,7 +3547,7 @@
                 <w:sz w:val="20"/>
                 <w:szCs w:val="20"/>
               </w:rPr>
-              <w:t>79.6%</w:t>
+              <w:t>93.8% (151/161)</w:t>
             </w:r>
           </w:p>
         </w:tc>
@@ -4219,7 +3641,7 @@
                 <w:sz w:val="20"/>
                 <w:szCs w:val="20"/>
               </w:rPr>
-              <w:t>66.7%</w:t>
+              <w:t>96.6% (28/29)</w:t>
             </w:r>
           </w:p>
         </w:tc>
@@ -4313,7 +3735,7 @@
                 <w:sz w:val="20"/>
                 <w:szCs w:val="20"/>
               </w:rPr>
-              <w:t>60.0%</w:t>
+              <w:t>93.3% (28/30)</w:t>
             </w:r>
           </w:p>
         </w:tc>
@@ -4407,7 +3829,7 @@
                 <w:sz w:val="20"/>
                 <w:szCs w:val="20"/>
               </w:rPr>
-              <w:t>36.5%</w:t>
+              <w:t>39.1% (9/23)</w:t>
             </w:r>
           </w:p>
         </w:tc>
@@ -4417,24 +3839,6 @@
       <w:pPr>
         <w:spacing w:after="200" w:before="0"/>
       </w:pPr>
-    </w:p>
-    <w:p>
-      <w:pPr>
-        <w:keepNext w:val="0"/>
-        <w:spacing w:after="160" w:before="0" w:line="348" w:lineRule="auto"/>
-        <w:jc w:val="both"/>
-      </w:pPr>
-      <w:r>
-        <w:rPr>
-          <w:rFonts w:ascii="Times New Roman" w:hAnsi="Times New Roman" w:cs="Times New Roman"/>
-          <w:b w:val="0"/>
-          <w:i w:val="0"/>
-          <w:color w:val="111111"/>
-          <w:sz w:val="23"/>
-          <w:szCs w:val="23"/>
-        </w:rPr>
-        <w:t>The ordering reveals a regular gradient: the layers at the top are the oldest and best supplied with data, those at the bottom the newest and most starved. Nothing in this ordering departs from the ordering of data volume — which sets up the diagnosis in the section that follows.</w:t>
-      </w:r>
     </w:p>
     <w:p>
       <w:pPr>
@@ -5682,6 +5086,42 @@
     </w:p>
     <w:p>
       <w:pPr>
+        <w:keepNext w:val="0"/>
+        <w:spacing w:after="160" w:before="0" w:line="348" w:lineRule="auto"/>
+        <w:jc w:val="both"/>
+      </w:pPr>
+      <w:r>
+        <w:rPr>
+          <w:rFonts w:ascii="Times New Roman" w:hAnsi="Times New Roman" w:cs="Times New Roman"/>
+          <w:b w:val="0"/>
+          <w:i w:val="0"/>
+          <w:color w:val="111111"/>
+          <w:sz w:val="23"/>
+          <w:szCs w:val="23"/>
+        </w:rPr>
+        <w:t>Inspecting the confusion matrices at this threshold reveals a striking property: across the brand, Fanta, XL, Coca and Cappy classifiers there is not a single confusion between one class and another in the entire test set. Every error is an abstention — the model failed to reach the threshold and stayed silent — rather than a misclassification. In the brand layer, for instance: 47 instances, 39 correct, 8 abstentions, zero confusions.</w:t>
+      </w:r>
+    </w:p>
+    <w:p>
+      <w:pPr>
+        <w:keepNext w:val="0"/>
+        <w:spacing w:after="160" w:before="0" w:line="348" w:lineRule="auto"/>
+        <w:jc w:val="both"/>
+      </w:pPr>
+      <w:r>
+        <w:rPr>
+          <w:rFonts w:ascii="Times New Roman" w:hAnsi="Times New Roman" w:cs="Times New Roman"/>
+          <w:b w:val="0"/>
+          <w:i w:val="0"/>
+          <w:color w:val="111111"/>
+          <w:sz w:val="23"/>
+          <w:szCs w:val="23"/>
+        </w:rPr>
+        <w:t>This property has direct operational value: the system does not call a Coca-Cola a Sprite; it is either right or silent. An abstention is a tractable error, referred to human review and corrected there, whereas a confident misclassification propagates into the report without arousing suspicion. The sole exception is the packaging classifier, the only one that shows genuine confusion (can with plastic eight times, glass to plastic twice) and never abstains — and also the only one operating on a physical property rather than a commercial identity.</w:t>
+      </w:r>
+    </w:p>
+    <w:p>
+      <w:pPr>
         <w:keepNext/>
         <w:spacing w:before="240" w:after="140"/>
         <w:jc w:val="left"/>
@@ -5745,7 +5185,7 @@
           <w:sz w:val="19"/>
           <w:szCs w:val="19"/>
         </w:rPr>
-        <w:t>Wilson 95% confidence intervals for classes scoring 100%. The same number, carrying entirely different meanings.</w:t>
+        <w:t>Wilson 95% confidence intervals for four classes, all scoring 100%. The same number, carrying entirely different meanings.</w:t>
       </w:r>
     </w:p>
     <w:tbl>
@@ -5973,288 +5413,6 @@
                 <w:sz w:val="20"/>
                 <w:szCs w:val="20"/>
               </w:rPr>
-              <w:t>fanta (brand)</w:t>
-            </w:r>
-          </w:p>
-        </w:tc>
-        <w:tc>
-          <w:tcPr>
-            <w:tcW w:type="dxa" w:w="2239"/>
-          </w:tcPr>
-          <w:p>
-            <w:pPr>
-              <w:spacing w:before="60" w:after="60"/>
-              <w:jc w:val="left"/>
-            </w:pPr>
-            <w:r/>
-            <w:r>
-              <w:rPr>
-                <w:rFonts w:ascii="Times New Roman" w:hAnsi="Times New Roman" w:cs="Times New Roman"/>
-                <w:b w:val="0"/>
-                <w:i w:val="0"/>
-                <w:color w:val="111111"/>
-                <w:sz w:val="20"/>
-                <w:szCs w:val="20"/>
-              </w:rPr>
-              <w:t>2/2</w:t>
-            </w:r>
-          </w:p>
-        </w:tc>
-        <w:tc>
-          <w:tcPr>
-            <w:tcW w:type="dxa" w:w="2239"/>
-          </w:tcPr>
-          <w:p>
-            <w:pPr>
-              <w:spacing w:before="60" w:after="60"/>
-              <w:jc w:val="left"/>
-            </w:pPr>
-            <w:r/>
-            <w:r>
-              <w:rPr>
-                <w:rFonts w:ascii="Times New Roman" w:hAnsi="Times New Roman" w:cs="Times New Roman"/>
-                <w:b w:val="0"/>
-                <w:i w:val="0"/>
-                <w:color w:val="111111"/>
-                <w:sz w:val="20"/>
-                <w:szCs w:val="20"/>
-              </w:rPr>
-              <w:t>100%</w:t>
-            </w:r>
-          </w:p>
-        </w:tc>
-        <w:tc>
-          <w:tcPr>
-            <w:tcW w:type="dxa" w:w="2239"/>
-          </w:tcPr>
-          <w:p>
-            <w:pPr>
-              <w:spacing w:before="60" w:after="60"/>
-              <w:jc w:val="left"/>
-            </w:pPr>
-            <w:r/>
-            <w:r>
-              <w:rPr>
-                <w:rFonts w:ascii="Times New Roman" w:hAnsi="Times New Roman" w:cs="Times New Roman"/>
-                <w:b w:val="0"/>
-                <w:i w:val="0"/>
-                <w:color w:val="111111"/>
-                <w:sz w:val="20"/>
-                <w:szCs w:val="20"/>
-              </w:rPr>
-              <w:t>34.2% – 100%</w:t>
-            </w:r>
-          </w:p>
-        </w:tc>
-      </w:tr>
-      <w:tr>
-        <w:tc>
-          <w:tcPr>
-            <w:tcW w:type="dxa" w:w="2239"/>
-          </w:tcPr>
-          <w:p>
-            <w:pPr>
-              <w:spacing w:before="60" w:after="60"/>
-              <w:jc w:val="left"/>
-            </w:pPr>
-            <w:r/>
-            <w:r>
-              <w:rPr>
-                <w:rFonts w:ascii="Times New Roman" w:hAnsi="Times New Roman" w:cs="Times New Roman"/>
-                <w:b w:val="0"/>
-                <w:i w:val="0"/>
-                <w:color w:val="111111"/>
-                <w:sz w:val="20"/>
-                <w:szCs w:val="20"/>
-              </w:rPr>
-              <w:t>cappy-mango</w:t>
-            </w:r>
-          </w:p>
-        </w:tc>
-        <w:tc>
-          <w:tcPr>
-            <w:tcW w:type="dxa" w:w="2239"/>
-          </w:tcPr>
-          <w:p>
-            <w:pPr>
-              <w:spacing w:before="60" w:after="60"/>
-              <w:jc w:val="left"/>
-            </w:pPr>
-            <w:r/>
-            <w:r>
-              <w:rPr>
-                <w:rFonts w:ascii="Times New Roman" w:hAnsi="Times New Roman" w:cs="Times New Roman"/>
-                <w:b w:val="0"/>
-                <w:i w:val="0"/>
-                <w:color w:val="111111"/>
-                <w:sz w:val="20"/>
-                <w:szCs w:val="20"/>
-              </w:rPr>
-              <w:t>2/2</w:t>
-            </w:r>
-          </w:p>
-        </w:tc>
-        <w:tc>
-          <w:tcPr>
-            <w:tcW w:type="dxa" w:w="2239"/>
-          </w:tcPr>
-          <w:p>
-            <w:pPr>
-              <w:spacing w:before="60" w:after="60"/>
-              <w:jc w:val="left"/>
-            </w:pPr>
-            <w:r/>
-            <w:r>
-              <w:rPr>
-                <w:rFonts w:ascii="Times New Roman" w:hAnsi="Times New Roman" w:cs="Times New Roman"/>
-                <w:b w:val="0"/>
-                <w:i w:val="0"/>
-                <w:color w:val="111111"/>
-                <w:sz w:val="20"/>
-                <w:szCs w:val="20"/>
-              </w:rPr>
-              <w:t>100%</w:t>
-            </w:r>
-          </w:p>
-        </w:tc>
-        <w:tc>
-          <w:tcPr>
-            <w:tcW w:type="dxa" w:w="2239"/>
-          </w:tcPr>
-          <w:p>
-            <w:pPr>
-              <w:spacing w:before="60" w:after="60"/>
-              <w:jc w:val="left"/>
-            </w:pPr>
-            <w:r/>
-            <w:r>
-              <w:rPr>
-                <w:rFonts w:ascii="Times New Roman" w:hAnsi="Times New Roman" w:cs="Times New Roman"/>
-                <w:b w:val="0"/>
-                <w:i w:val="0"/>
-                <w:color w:val="111111"/>
-                <w:sz w:val="20"/>
-                <w:szCs w:val="20"/>
-              </w:rPr>
-              <w:t>34.2% – 100%</w:t>
-            </w:r>
-          </w:p>
-        </w:tc>
-      </w:tr>
-      <w:tr>
-        <w:tc>
-          <w:tcPr>
-            <w:tcW w:type="dxa" w:w="2239"/>
-          </w:tcPr>
-          <w:p>
-            <w:pPr>
-              <w:spacing w:before="60" w:after="60"/>
-              <w:jc w:val="left"/>
-            </w:pPr>
-            <w:r/>
-            <w:r>
-              <w:rPr>
-                <w:rFonts w:ascii="Times New Roman" w:hAnsi="Times New Roman" w:cs="Times New Roman"/>
-                <w:b w:val="0"/>
-                <w:i w:val="0"/>
-                <w:color w:val="111111"/>
-                <w:sz w:val="20"/>
-                <w:szCs w:val="20"/>
-              </w:rPr>
-              <w:t>fanta-redapple</w:t>
-            </w:r>
-          </w:p>
-        </w:tc>
-        <w:tc>
-          <w:tcPr>
-            <w:tcW w:type="dxa" w:w="2239"/>
-          </w:tcPr>
-          <w:p>
-            <w:pPr>
-              <w:spacing w:before="60" w:after="60"/>
-              <w:jc w:val="left"/>
-            </w:pPr>
-            <w:r/>
-            <w:r>
-              <w:rPr>
-                <w:rFonts w:ascii="Times New Roman" w:hAnsi="Times New Roman" w:cs="Times New Roman"/>
-                <w:b w:val="0"/>
-                <w:i w:val="0"/>
-                <w:color w:val="111111"/>
-                <w:sz w:val="20"/>
-                <w:szCs w:val="20"/>
-              </w:rPr>
-              <w:t>3/3</w:t>
-            </w:r>
-          </w:p>
-        </w:tc>
-        <w:tc>
-          <w:tcPr>
-            <w:tcW w:type="dxa" w:w="2239"/>
-          </w:tcPr>
-          <w:p>
-            <w:pPr>
-              <w:spacing w:before="60" w:after="60"/>
-              <w:jc w:val="left"/>
-            </w:pPr>
-            <w:r/>
-            <w:r>
-              <w:rPr>
-                <w:rFonts w:ascii="Times New Roman" w:hAnsi="Times New Roman" w:cs="Times New Roman"/>
-                <w:b w:val="0"/>
-                <w:i w:val="0"/>
-                <w:color w:val="111111"/>
-                <w:sz w:val="20"/>
-                <w:szCs w:val="20"/>
-              </w:rPr>
-              <w:t>100%</w:t>
-            </w:r>
-          </w:p>
-        </w:tc>
-        <w:tc>
-          <w:tcPr>
-            <w:tcW w:type="dxa" w:w="2239"/>
-          </w:tcPr>
-          <w:p>
-            <w:pPr>
-              <w:spacing w:before="60" w:after="60"/>
-              <w:jc w:val="left"/>
-            </w:pPr>
-            <w:r/>
-            <w:r>
-              <w:rPr>
-                <w:rFonts w:ascii="Times New Roman" w:hAnsi="Times New Roman" w:cs="Times New Roman"/>
-                <w:b w:val="0"/>
-                <w:i w:val="0"/>
-                <w:color w:val="111111"/>
-                <w:sz w:val="20"/>
-                <w:szCs w:val="20"/>
-              </w:rPr>
-              <w:t>43.8% – 100%</w:t>
-            </w:r>
-          </w:p>
-        </w:tc>
-      </w:tr>
-      <w:tr>
-        <w:tc>
-          <w:tcPr>
-            <w:tcW w:type="dxa" w:w="2239"/>
-          </w:tcPr>
-          <w:p>
-            <w:pPr>
-              <w:spacing w:before="60" w:after="60"/>
-              <w:jc w:val="left"/>
-            </w:pPr>
-            <w:r/>
-            <w:r>
-              <w:rPr>
-                <w:rFonts w:ascii="Times New Roman" w:hAnsi="Times New Roman" w:cs="Times New Roman"/>
-                <w:b w:val="0"/>
-                <w:i w:val="0"/>
-                <w:color w:val="111111"/>
-                <w:sz w:val="20"/>
-                <w:szCs w:val="20"/>
-              </w:rPr>
               <w:t>xl-red</w:t>
             </w:r>
           </w:p>
@@ -6443,100 +5601,6 @@
                 <w:sz w:val="20"/>
                 <w:szCs w:val="20"/>
               </w:rPr>
-              <w:t>xl-classic</w:t>
-            </w:r>
-          </w:p>
-        </w:tc>
-        <w:tc>
-          <w:tcPr>
-            <w:tcW w:type="dxa" w:w="2239"/>
-          </w:tcPr>
-          <w:p>
-            <w:pPr>
-              <w:spacing w:before="60" w:after="60"/>
-              <w:jc w:val="left"/>
-            </w:pPr>
-            <w:r/>
-            <w:r>
-              <w:rPr>
-                <w:rFonts w:ascii="Times New Roman" w:hAnsi="Times New Roman" w:cs="Times New Roman"/>
-                <w:b w:val="0"/>
-                <w:i w:val="0"/>
-                <w:color w:val="111111"/>
-                <w:sz w:val="20"/>
-                <w:szCs w:val="20"/>
-              </w:rPr>
-              <w:t>24/24</w:t>
-            </w:r>
-          </w:p>
-        </w:tc>
-        <w:tc>
-          <w:tcPr>
-            <w:tcW w:type="dxa" w:w="2239"/>
-          </w:tcPr>
-          <w:p>
-            <w:pPr>
-              <w:spacing w:before="60" w:after="60"/>
-              <w:jc w:val="left"/>
-            </w:pPr>
-            <w:r/>
-            <w:r>
-              <w:rPr>
-                <w:rFonts w:ascii="Times New Roman" w:hAnsi="Times New Roman" w:cs="Times New Roman"/>
-                <w:b w:val="0"/>
-                <w:i w:val="0"/>
-                <w:color w:val="111111"/>
-                <w:sz w:val="20"/>
-                <w:szCs w:val="20"/>
-              </w:rPr>
-              <w:t>100%</w:t>
-            </w:r>
-          </w:p>
-        </w:tc>
-        <w:tc>
-          <w:tcPr>
-            <w:tcW w:type="dxa" w:w="2239"/>
-          </w:tcPr>
-          <w:p>
-            <w:pPr>
-              <w:spacing w:before="60" w:after="60"/>
-              <w:jc w:val="left"/>
-            </w:pPr>
-            <w:r/>
-            <w:r>
-              <w:rPr>
-                <w:rFonts w:ascii="Times New Roman" w:hAnsi="Times New Roman" w:cs="Times New Roman"/>
-                <w:b w:val="0"/>
-                <w:i w:val="0"/>
-                <w:color w:val="111111"/>
-                <w:sz w:val="20"/>
-                <w:szCs w:val="20"/>
-              </w:rPr>
-              <w:t>86.2% – 100%</w:t>
-            </w:r>
-          </w:p>
-        </w:tc>
-      </w:tr>
-      <w:tr>
-        <w:tc>
-          <w:tcPr>
-            <w:tcW w:type="dxa" w:w="2239"/>
-          </w:tcPr>
-          <w:p>
-            <w:pPr>
-              <w:spacing w:before="60" w:after="60"/>
-              <w:jc w:val="left"/>
-            </w:pPr>
-            <w:r/>
-            <w:r>
-              <w:rPr>
-                <w:rFonts w:ascii="Times New Roman" w:hAnsi="Times New Roman" w:cs="Times New Roman"/>
-                <w:b w:val="0"/>
-                <w:i w:val="0"/>
-                <w:color w:val="111111"/>
-                <w:sz w:val="20"/>
-                <w:szCs w:val="20"/>
-              </w:rPr>
               <w:t>coca-classic</w:t>
             </w:r>
           </w:p>
@@ -6632,7 +5696,7 @@
           <w:sz w:val="23"/>
           <w:szCs w:val="23"/>
         </w:rPr>
-        <w:t>The sprite class scores 100% on a single test image, and the true interval for its performance runs from 20.7% to 100% — that is, the number carries almost no information. By contrast xl-classic, on 24 instances, has an interval of 86.2%–100%, which is a statement with content. The two figures are identical on the page and fundamentally different in substance, and nothing distinguishes them except the instance count — which is why it is stated in every table above.</w:t>
+        <w:t>The sprite class scores 100% on a single test image, and the true interval for its performance runs from 20.7% to 100% — that is, the number carries almost no information. By contrast coca-classic, on 26 instances, has an interval of 87.1%–100%, which is a statement with content. The two figures are identical on the page and fundamentally different in substance, and nothing distinguishes them except the instance count — which is why it is stated in every table in this study.</w:t>
       </w:r>
     </w:p>
     <w:p>
@@ -6650,737 +5714,7 @@
           <w:sz w:val="23"/>
           <w:szCs w:val="23"/>
         </w:rPr>
-        <w:t>Small samples have a second effect, on the aggregate figures. The platform computes a per-class average, so a class with 24 instances counts equally with a class holding one. Weighting by instance count gives a markedly different picture.</w:t>
-      </w:r>
-    </w:p>
-    <w:p>
-      <w:pPr>
-        <w:keepNext/>
-        <w:spacing w:before="240" w:after="100"/>
-        <w:jc w:val="center"/>
-      </w:pPr>
-      <w:r>
-        <w:rPr>
-          <w:rFonts w:ascii="Times New Roman" w:hAnsi="Times New Roman" w:cs="Times New Roman"/>
-          <w:b/>
-          <w:bCs w:val="1"/>
-          <w:i w:val="0"/>
-          <w:color w:val="555555"/>
-          <w:sz w:val="19"/>
-          <w:szCs w:val="19"/>
-        </w:rPr>
-        <w:t xml:space="preserve">Table 8. </w:t>
-      </w:r>
-      <w:r>
-        <w:rPr>
-          <w:rFonts w:ascii="Times New Roman" w:hAnsi="Times New Roman" w:cs="Times New Roman"/>
-          <w:b w:val="0"/>
-          <w:i/>
-          <w:iCs w:val="1"/>
-          <w:color w:val="555555"/>
-          <w:sz w:val="19"/>
-          <w:szCs w:val="19"/>
-        </w:rPr>
-        <w:t>Recall computed both ways. The figures reported throughout this study are the per-class average, which is the more conservative of the two.</w:t>
-      </w:r>
-    </w:p>
-    <w:tbl>
-      <w:tblPr>
-        <w:tblStyle w:val="TableGrid"/>
-        <w:tblW w:type="auto" w:w="0"/>
-        <w:jc w:val="left"/>
-        <w:tblLook w:firstColumn="1" w:firstRow="1" w:lastColumn="0" w:lastRow="0" w:noHBand="0" w:noVBand="1" w:val="04A0"/>
-      </w:tblPr>
-      <w:tblGrid>
-        <w:gridCol w:w="2239"/>
-        <w:gridCol w:w="2239"/>
-        <w:gridCol w:w="2239"/>
-        <w:gridCol w:w="2239"/>
-      </w:tblGrid>
-      <w:tr>
-        <w:tc>
-          <w:tcPr>
-            <w:tcW w:type="dxa" w:w="2239"/>
-          </w:tcPr>
-          <w:p>
-            <w:pPr>
-              <w:spacing w:before="60" w:after="60"/>
-              <w:jc w:val="left"/>
-            </w:pPr>
-            <w:r/>
-            <w:r>
-              <w:rPr>
-                <w:rFonts w:ascii="Times New Roman" w:hAnsi="Times New Roman" w:cs="Times New Roman"/>
-                <w:b/>
-                <w:bCs w:val="1"/>
-                <w:i w:val="0"/>
-                <w:color w:val="111111"/>
-                <w:sz w:val="20"/>
-                <w:szCs w:val="20"/>
-              </w:rPr>
-              <w:t>Classifier</w:t>
-            </w:r>
-          </w:p>
-        </w:tc>
-        <w:tc>
-          <w:tcPr>
-            <w:tcW w:type="dxa" w:w="2239"/>
-          </w:tcPr>
-          <w:p>
-            <w:pPr>
-              <w:spacing w:before="60" w:after="60"/>
-              <w:jc w:val="left"/>
-            </w:pPr>
-            <w:r/>
-            <w:r>
-              <w:rPr>
-                <w:rFonts w:ascii="Times New Roman" w:hAnsi="Times New Roman" w:cs="Times New Roman"/>
-                <w:b/>
-                <w:bCs w:val="1"/>
-                <w:i w:val="0"/>
-                <w:color w:val="111111"/>
-                <w:sz w:val="20"/>
-                <w:szCs w:val="20"/>
-              </w:rPr>
-              <w:t>Per-class average</w:t>
-            </w:r>
-          </w:p>
-        </w:tc>
-        <w:tc>
-          <w:tcPr>
-            <w:tcW w:type="dxa" w:w="2239"/>
-          </w:tcPr>
-          <w:p>
-            <w:pPr>
-              <w:spacing w:before="60" w:after="60"/>
-              <w:jc w:val="left"/>
-            </w:pPr>
-            <w:r/>
-            <w:r>
-              <w:rPr>
-                <w:rFonts w:ascii="Times New Roman" w:hAnsi="Times New Roman" w:cs="Times New Roman"/>
-                <w:b/>
-                <w:bCs w:val="1"/>
-                <w:i w:val="0"/>
-                <w:color w:val="111111"/>
-                <w:sz w:val="20"/>
-                <w:szCs w:val="20"/>
-              </w:rPr>
-              <w:t>Per-instance average</w:t>
-            </w:r>
-          </w:p>
-        </w:tc>
-        <w:tc>
-          <w:tcPr>
-            <w:tcW w:type="dxa" w:w="2239"/>
-          </w:tcPr>
-          <w:p>
-            <w:pPr>
-              <w:spacing w:before="60" w:after="60"/>
-              <w:jc w:val="left"/>
-            </w:pPr>
-            <w:r/>
-            <w:r>
-              <w:rPr>
-                <w:rFonts w:ascii="Times New Roman" w:hAnsi="Times New Roman" w:cs="Times New Roman"/>
-                <w:b/>
-                <w:bCs w:val="1"/>
-                <w:i w:val="0"/>
-                <w:color w:val="111111"/>
-                <w:sz w:val="20"/>
-                <w:szCs w:val="20"/>
-              </w:rPr>
-              <w:t>Difference</w:t>
-            </w:r>
-          </w:p>
-        </w:tc>
-      </w:tr>
-      <w:tr>
-        <w:tc>
-          <w:tcPr>
-            <w:tcW w:type="dxa" w:w="2239"/>
-          </w:tcPr>
-          <w:p>
-            <w:pPr>
-              <w:spacing w:before="60" w:after="60"/>
-              <w:jc w:val="left"/>
-            </w:pPr>
-            <w:r/>
-            <w:r>
-              <w:rPr>
-                <w:rFonts w:ascii="Times New Roman" w:hAnsi="Times New Roman" w:cs="Times New Roman"/>
-                <w:b w:val="0"/>
-                <w:i w:val="0"/>
-                <w:color w:val="111111"/>
-                <w:sz w:val="20"/>
-                <w:szCs w:val="20"/>
-              </w:rPr>
-              <w:t>XL Energy</w:t>
-            </w:r>
-          </w:p>
-        </w:tc>
-        <w:tc>
-          <w:tcPr>
-            <w:tcW w:type="dxa" w:w="2239"/>
-          </w:tcPr>
-          <w:p>
-            <w:pPr>
-              <w:spacing w:before="60" w:after="60"/>
-              <w:jc w:val="left"/>
-            </w:pPr>
-            <w:r/>
-            <w:r>
-              <w:rPr>
-                <w:rFonts w:ascii="Times New Roman" w:hAnsi="Times New Roman" w:cs="Times New Roman"/>
-                <w:b w:val="0"/>
-                <w:i w:val="0"/>
-                <w:color w:val="111111"/>
-                <w:sz w:val="20"/>
-                <w:szCs w:val="20"/>
-              </w:rPr>
-              <w:t>66.7%</w:t>
-            </w:r>
-          </w:p>
-        </w:tc>
-        <w:tc>
-          <w:tcPr>
-            <w:tcW w:type="dxa" w:w="2239"/>
-          </w:tcPr>
-          <w:p>
-            <w:pPr>
-              <w:spacing w:before="60" w:after="60"/>
-              <w:jc w:val="left"/>
-            </w:pPr>
-            <w:r/>
-            <w:r>
-              <w:rPr>
-                <w:rFonts w:ascii="Times New Roman" w:hAnsi="Times New Roman" w:cs="Times New Roman"/>
-                <w:b w:val="0"/>
-                <w:i w:val="0"/>
-                <w:color w:val="111111"/>
-                <w:sz w:val="20"/>
-                <w:szCs w:val="20"/>
-              </w:rPr>
-              <w:t>96.6% (28/29)</w:t>
-            </w:r>
-          </w:p>
-        </w:tc>
-        <w:tc>
-          <w:tcPr>
-            <w:tcW w:type="dxa" w:w="2239"/>
-          </w:tcPr>
-          <w:p>
-            <w:pPr>
-              <w:spacing w:before="60" w:after="60"/>
-              <w:jc w:val="left"/>
-            </w:pPr>
-            <w:r/>
-            <w:r>
-              <w:rPr>
-                <w:rFonts w:ascii="Times New Roman" w:hAnsi="Times New Roman" w:cs="Times New Roman"/>
-                <w:b w:val="0"/>
-                <w:i w:val="0"/>
-                <w:color w:val="111111"/>
-                <w:sz w:val="20"/>
-                <w:szCs w:val="20"/>
-              </w:rPr>
-              <w:t>+29.9</w:t>
-            </w:r>
-          </w:p>
-        </w:tc>
-      </w:tr>
-      <w:tr>
-        <w:tc>
-          <w:tcPr>
-            <w:tcW w:type="dxa" w:w="2239"/>
-          </w:tcPr>
-          <w:p>
-            <w:pPr>
-              <w:spacing w:before="60" w:after="60"/>
-              <w:jc w:val="left"/>
-            </w:pPr>
-            <w:r/>
-            <w:r>
-              <w:rPr>
-                <w:rFonts w:ascii="Times New Roman" w:hAnsi="Times New Roman" w:cs="Times New Roman"/>
-                <w:b w:val="0"/>
-                <w:i w:val="0"/>
-                <w:color w:val="111111"/>
-                <w:sz w:val="20"/>
-                <w:szCs w:val="20"/>
-              </w:rPr>
-              <w:t>Coca-Cola</w:t>
-            </w:r>
-          </w:p>
-        </w:tc>
-        <w:tc>
-          <w:tcPr>
-            <w:tcW w:type="dxa" w:w="2239"/>
-          </w:tcPr>
-          <w:p>
-            <w:pPr>
-              <w:spacing w:before="60" w:after="60"/>
-              <w:jc w:val="left"/>
-            </w:pPr>
-            <w:r/>
-            <w:r>
-              <w:rPr>
-                <w:rFonts w:ascii="Times New Roman" w:hAnsi="Times New Roman" w:cs="Times New Roman"/>
-                <w:b w:val="0"/>
-                <w:i w:val="0"/>
-                <w:color w:val="111111"/>
-                <w:sz w:val="20"/>
-                <w:szCs w:val="20"/>
-              </w:rPr>
-              <w:t>55.6%</w:t>
-            </w:r>
-          </w:p>
-        </w:tc>
-        <w:tc>
-          <w:tcPr>
-            <w:tcW w:type="dxa" w:w="2239"/>
-          </w:tcPr>
-          <w:p>
-            <w:pPr>
-              <w:spacing w:before="60" w:after="60"/>
-              <w:jc w:val="left"/>
-            </w:pPr>
-            <w:r/>
-            <w:r>
-              <w:rPr>
-                <w:rFonts w:ascii="Times New Roman" w:hAnsi="Times New Roman" w:cs="Times New Roman"/>
-                <w:b w:val="0"/>
-                <w:i w:val="0"/>
-                <w:color w:val="111111"/>
-                <w:sz w:val="20"/>
-                <w:szCs w:val="20"/>
-              </w:rPr>
-              <w:t>93.3% (28/30)</w:t>
-            </w:r>
-          </w:p>
-        </w:tc>
-        <w:tc>
-          <w:tcPr>
-            <w:tcW w:type="dxa" w:w="2239"/>
-          </w:tcPr>
-          <w:p>
-            <w:pPr>
-              <w:spacing w:before="60" w:after="60"/>
-              <w:jc w:val="left"/>
-            </w:pPr>
-            <w:r/>
-            <w:r>
-              <w:rPr>
-                <w:rFonts w:ascii="Times New Roman" w:hAnsi="Times New Roman" w:cs="Times New Roman"/>
-                <w:b w:val="0"/>
-                <w:i w:val="0"/>
-                <w:color w:val="111111"/>
-                <w:sz w:val="20"/>
-                <w:szCs w:val="20"/>
-              </w:rPr>
-              <w:t>+37.7</w:t>
-            </w:r>
-          </w:p>
-        </w:tc>
-      </w:tr>
-      <w:tr>
-        <w:tc>
-          <w:tcPr>
-            <w:tcW w:type="dxa" w:w="2239"/>
-          </w:tcPr>
-          <w:p>
-            <w:pPr>
-              <w:spacing w:before="60" w:after="60"/>
-              <w:jc w:val="left"/>
-            </w:pPr>
-            <w:r/>
-            <w:r>
-              <w:rPr>
-                <w:rFonts w:ascii="Times New Roman" w:hAnsi="Times New Roman" w:cs="Times New Roman"/>
-                <w:b w:val="0"/>
-                <w:i w:val="0"/>
-                <w:color w:val="111111"/>
-                <w:sz w:val="20"/>
-                <w:szCs w:val="20"/>
-              </w:rPr>
-              <w:t>Packaging</w:t>
-            </w:r>
-          </w:p>
-        </w:tc>
-        <w:tc>
-          <w:tcPr>
-            <w:tcW w:type="dxa" w:w="2239"/>
-          </w:tcPr>
-          <w:p>
-            <w:pPr>
-              <w:spacing w:before="60" w:after="60"/>
-              <w:jc w:val="left"/>
-            </w:pPr>
-            <w:r/>
-            <w:r>
-              <w:rPr>
-                <w:rFonts w:ascii="Times New Roman" w:hAnsi="Times New Roman" w:cs="Times New Roman"/>
-                <w:b w:val="0"/>
-                <w:i w:val="0"/>
-                <w:color w:val="111111"/>
-                <w:sz w:val="20"/>
-                <w:szCs w:val="20"/>
-              </w:rPr>
-              <w:t>74.4%</w:t>
-            </w:r>
-          </w:p>
-        </w:tc>
-        <w:tc>
-          <w:tcPr>
-            <w:tcW w:type="dxa" w:w="2239"/>
-          </w:tcPr>
-          <w:p>
-            <w:pPr>
-              <w:spacing w:before="60" w:after="60"/>
-              <w:jc w:val="left"/>
-            </w:pPr>
-            <w:r/>
-            <w:r>
-              <w:rPr>
-                <w:rFonts w:ascii="Times New Roman" w:hAnsi="Times New Roman" w:cs="Times New Roman"/>
-                <w:b w:val="0"/>
-                <w:i w:val="0"/>
-                <w:color w:val="111111"/>
-                <w:sz w:val="20"/>
-                <w:szCs w:val="20"/>
-              </w:rPr>
-              <w:t>93.8% (151/161)</w:t>
-            </w:r>
-          </w:p>
-        </w:tc>
-        <w:tc>
-          <w:tcPr>
-            <w:tcW w:type="dxa" w:w="2239"/>
-          </w:tcPr>
-          <w:p>
-            <w:pPr>
-              <w:spacing w:before="60" w:after="60"/>
-              <w:jc w:val="left"/>
-            </w:pPr>
-            <w:r/>
-            <w:r>
-              <w:rPr>
-                <w:rFonts w:ascii="Times New Roman" w:hAnsi="Times New Roman" w:cs="Times New Roman"/>
-                <w:b w:val="0"/>
-                <w:i w:val="0"/>
-                <w:color w:val="111111"/>
-                <w:sz w:val="20"/>
-                <w:szCs w:val="20"/>
-              </w:rPr>
-              <w:t>+19.4</w:t>
-            </w:r>
-          </w:p>
-        </w:tc>
-      </w:tr>
-      <w:tr>
-        <w:tc>
-          <w:tcPr>
-            <w:tcW w:type="dxa" w:w="2239"/>
-          </w:tcPr>
-          <w:p>
-            <w:pPr>
-              <w:spacing w:before="60" w:after="60"/>
-              <w:jc w:val="left"/>
-            </w:pPr>
-            <w:r/>
-            <w:r>
-              <w:rPr>
-                <w:rFonts w:ascii="Times New Roman" w:hAnsi="Times New Roman" w:cs="Times New Roman"/>
-                <w:b w:val="0"/>
-                <w:i w:val="0"/>
-                <w:color w:val="111111"/>
-                <w:sz w:val="20"/>
-                <w:szCs w:val="20"/>
-              </w:rPr>
-              <w:t>Fanta</w:t>
-            </w:r>
-          </w:p>
-        </w:tc>
-        <w:tc>
-          <w:tcPr>
-            <w:tcW w:type="dxa" w:w="2239"/>
-          </w:tcPr>
-          <w:p>
-            <w:pPr>
-              <w:spacing w:before="60" w:after="60"/>
-              <w:jc w:val="left"/>
-            </w:pPr>
-            <w:r/>
-            <w:r>
-              <w:rPr>
-                <w:rFonts w:ascii="Times New Roman" w:hAnsi="Times New Roman" w:cs="Times New Roman"/>
-                <w:b w:val="0"/>
-                <w:i w:val="0"/>
-                <w:color w:val="111111"/>
-                <w:sz w:val="20"/>
-                <w:szCs w:val="20"/>
-              </w:rPr>
-              <w:t>88.9%</w:t>
-            </w:r>
-          </w:p>
-        </w:tc>
-        <w:tc>
-          <w:tcPr>
-            <w:tcW w:type="dxa" w:w="2239"/>
-          </w:tcPr>
-          <w:p>
-            <w:pPr>
-              <w:spacing w:before="60" w:after="60"/>
-              <w:jc w:val="left"/>
-            </w:pPr>
-            <w:r/>
-            <w:r>
-              <w:rPr>
-                <w:rFonts w:ascii="Times New Roman" w:hAnsi="Times New Roman" w:cs="Times New Roman"/>
-                <w:b w:val="0"/>
-                <w:i w:val="0"/>
-                <w:color w:val="111111"/>
-                <w:sz w:val="20"/>
-                <w:szCs w:val="20"/>
-              </w:rPr>
-              <w:t>94.4% (17/18)</w:t>
-            </w:r>
-          </w:p>
-        </w:tc>
-        <w:tc>
-          <w:tcPr>
-            <w:tcW w:type="dxa" w:w="2239"/>
-          </w:tcPr>
-          <w:p>
-            <w:pPr>
-              <w:spacing w:before="60" w:after="60"/>
-              <w:jc w:val="left"/>
-            </w:pPr>
-            <w:r/>
-            <w:r>
-              <w:rPr>
-                <w:rFonts w:ascii="Times New Roman" w:hAnsi="Times New Roman" w:cs="Times New Roman"/>
-                <w:b w:val="0"/>
-                <w:i w:val="0"/>
-                <w:color w:val="111111"/>
-                <w:sz w:val="20"/>
-                <w:szCs w:val="20"/>
-              </w:rPr>
-              <w:t>+5.5</w:t>
-            </w:r>
-          </w:p>
-        </w:tc>
-      </w:tr>
-      <w:tr>
-        <w:tc>
-          <w:tcPr>
-            <w:tcW w:type="dxa" w:w="2239"/>
-          </w:tcPr>
-          <w:p>
-            <w:pPr>
-              <w:spacing w:before="60" w:after="60"/>
-              <w:jc w:val="left"/>
-            </w:pPr>
-            <w:r/>
-            <w:r>
-              <w:rPr>
-                <w:rFonts w:ascii="Times New Roman" w:hAnsi="Times New Roman" w:cs="Times New Roman"/>
-                <w:b w:val="0"/>
-                <w:i w:val="0"/>
-                <w:color w:val="111111"/>
-                <w:sz w:val="20"/>
-                <w:szCs w:val="20"/>
-              </w:rPr>
-              <w:t>Cappy</w:t>
-            </w:r>
-          </w:p>
-        </w:tc>
-        <w:tc>
-          <w:tcPr>
-            <w:tcW w:type="dxa" w:w="2239"/>
-          </w:tcPr>
-          <w:p>
-            <w:pPr>
-              <w:spacing w:before="60" w:after="60"/>
-              <w:jc w:val="left"/>
-            </w:pPr>
-            <w:r/>
-            <w:r>
-              <w:rPr>
-                <w:rFonts w:ascii="Times New Roman" w:hAnsi="Times New Roman" w:cs="Times New Roman"/>
-                <w:b w:val="0"/>
-                <w:i w:val="0"/>
-                <w:color w:val="111111"/>
-                <w:sz w:val="20"/>
-                <w:szCs w:val="20"/>
-              </w:rPr>
-              <w:t>31.2%</w:t>
-            </w:r>
-          </w:p>
-        </w:tc>
-        <w:tc>
-          <w:tcPr>
-            <w:tcW w:type="dxa" w:w="2239"/>
-          </w:tcPr>
-          <w:p>
-            <w:pPr>
-              <w:spacing w:before="60" w:after="60"/>
-              <w:jc w:val="left"/>
-            </w:pPr>
-            <w:r/>
-            <w:r>
-              <w:rPr>
-                <w:rFonts w:ascii="Times New Roman" w:hAnsi="Times New Roman" w:cs="Times New Roman"/>
-                <w:b w:val="0"/>
-                <w:i w:val="0"/>
-                <w:color w:val="111111"/>
-                <w:sz w:val="20"/>
-                <w:szCs w:val="20"/>
-              </w:rPr>
-              <w:t>39.1% (9/23)</w:t>
-            </w:r>
-          </w:p>
-        </w:tc>
-        <w:tc>
-          <w:tcPr>
-            <w:tcW w:type="dxa" w:w="2239"/>
-          </w:tcPr>
-          <w:p>
-            <w:pPr>
-              <w:spacing w:before="60" w:after="60"/>
-              <w:jc w:val="left"/>
-            </w:pPr>
-            <w:r/>
-            <w:r>
-              <w:rPr>
-                <w:rFonts w:ascii="Times New Roman" w:hAnsi="Times New Roman" w:cs="Times New Roman"/>
-                <w:b w:val="0"/>
-                <w:i w:val="0"/>
-                <w:color w:val="111111"/>
-                <w:sz w:val="20"/>
-                <w:szCs w:val="20"/>
-              </w:rPr>
-              <w:t>+7.9</w:t>
-            </w:r>
-          </w:p>
-        </w:tc>
-      </w:tr>
-      <w:tr>
-        <w:tc>
-          <w:tcPr>
-            <w:tcW w:type="dxa" w:w="2239"/>
-          </w:tcPr>
-          <w:p>
-            <w:pPr>
-              <w:spacing w:before="60" w:after="60"/>
-              <w:jc w:val="left"/>
-            </w:pPr>
-            <w:r/>
-            <w:r>
-              <w:rPr>
-                <w:rFonts w:ascii="Times New Roman" w:hAnsi="Times New Roman" w:cs="Times New Roman"/>
-                <w:b w:val="0"/>
-                <w:i w:val="0"/>
-                <w:color w:val="111111"/>
-                <w:sz w:val="20"/>
-                <w:szCs w:val="20"/>
-              </w:rPr>
-              <w:t>Brand</w:t>
-            </w:r>
-          </w:p>
-        </w:tc>
-        <w:tc>
-          <w:tcPr>
-            <w:tcW w:type="dxa" w:w="2239"/>
-          </w:tcPr>
-          <w:p>
-            <w:pPr>
-              <w:spacing w:before="60" w:after="60"/>
-              <w:jc w:val="left"/>
-            </w:pPr>
-            <w:r/>
-            <w:r>
-              <w:rPr>
-                <w:rFonts w:ascii="Times New Roman" w:hAnsi="Times New Roman" w:cs="Times New Roman"/>
-                <w:b w:val="0"/>
-                <w:i w:val="0"/>
-                <w:color w:val="111111"/>
-                <w:sz w:val="20"/>
-                <w:szCs w:val="20"/>
-              </w:rPr>
-              <w:t>89.1%</w:t>
-            </w:r>
-          </w:p>
-        </w:tc>
-        <w:tc>
-          <w:tcPr>
-            <w:tcW w:type="dxa" w:w="2239"/>
-          </w:tcPr>
-          <w:p>
-            <w:pPr>
-              <w:spacing w:before="60" w:after="60"/>
-              <w:jc w:val="left"/>
-            </w:pPr>
-            <w:r/>
-            <w:r>
-              <w:rPr>
-                <w:rFonts w:ascii="Times New Roman" w:hAnsi="Times New Roman" w:cs="Times New Roman"/>
-                <w:b w:val="0"/>
-                <w:i w:val="0"/>
-                <w:color w:val="111111"/>
-                <w:sz w:val="20"/>
-                <w:szCs w:val="20"/>
-              </w:rPr>
-              <w:t>83.0% (39/47)</w:t>
-            </w:r>
-          </w:p>
-        </w:tc>
-        <w:tc>
-          <w:tcPr>
-            <w:tcW w:type="dxa" w:w="2239"/>
-          </w:tcPr>
-          <w:p>
-            <w:pPr>
-              <w:spacing w:before="60" w:after="60"/>
-              <w:jc w:val="left"/>
-            </w:pPr>
-            <w:r/>
-            <w:r>
-              <w:rPr>
-                <w:rFonts w:ascii="Times New Roman" w:hAnsi="Times New Roman" w:cs="Times New Roman"/>
-                <w:b w:val="0"/>
-                <w:i w:val="0"/>
-                <w:color w:val="111111"/>
-                <w:sz w:val="20"/>
-                <w:szCs w:val="20"/>
-              </w:rPr>
-              <w:t>−6.1</w:t>
-            </w:r>
-          </w:p>
-        </w:tc>
-      </w:tr>
-    </w:tbl>
-    <w:p>
-      <w:pPr>
-        <w:spacing w:after="200" w:before="0"/>
-      </w:pPr>
-    </w:p>
-    <w:p>
-      <w:pPr>
-        <w:keepNext w:val="0"/>
-        <w:spacing w:after="160" w:before="0" w:line="348" w:lineRule="auto"/>
-        <w:jc w:val="both"/>
-      </w:pPr>
-      <w:r>
-        <w:rPr>
-          <w:rFonts w:ascii="Times New Roman" w:hAnsi="Times New Roman" w:cs="Times New Roman"/>
-          <w:b w:val="0"/>
-          <w:i w:val="0"/>
-          <w:color w:val="111111"/>
-          <w:sz w:val="23"/>
-          <w:szCs w:val="23"/>
-        </w:rPr>
-        <w:t>XL's 66.7% is the clearest illustration of how fragile a per-class average can be: it means “two classes out of three”, and one of the three holds a single instance. Had that one image cleared the threshold, the figure would read 100%. A number that swings by a third on the strength of one image is volatility, not measurement. Set against that, 28 of the 29 actual products in the test set were classified correctly.</w:t>
+        <w:t>Small samples have a second effect, visible in the two recall columns of the table in Section 5.3: the per-class average weighs a class holding one instance as heavily as a class holding 24. XL's 66.7% is the clearest illustration — it means “two classes out of three”, and the third holds a single instance; had that one image cleared the threshold, the figure would read 100%. A number that swings by a third on the strength of one image is volatility, not measurement — while by the per-instance average, 28 of the 29 actual products in the test set were classified correctly (96.6%).</w:t>
       </w:r>
     </w:p>
     <w:p>
@@ -7398,43 +5732,7 @@
           <w:sz w:val="23"/>
           <w:szCs w:val="23"/>
         </w:rPr>
-        <w:t>Both averages are valid, but they answer different questions. The per-class average asks “how does the system handle the average class?”, exposing and penalising data gaps; the per-instance average asks “how does it handle the average product on a shelf?”, which is what a client actually experiences. This study reports the former because it is the more conservative, and states the latter here so the former is not misread.</w:t>
-      </w:r>
-    </w:p>
-    <w:p>
-      <w:pPr>
-        <w:keepNext w:val="0"/>
-        <w:spacing w:after="160" w:before="0" w:line="348" w:lineRule="auto"/>
-        <w:jc w:val="both"/>
-      </w:pPr>
-      <w:r>
-        <w:rPr>
-          <w:rFonts w:ascii="Times New Roman" w:hAnsi="Times New Roman" w:cs="Times New Roman"/>
-          <w:b w:val="0"/>
-          <w:i w:val="0"/>
-          <w:color w:val="111111"/>
-          <w:sz w:val="23"/>
-          <w:szCs w:val="23"/>
-        </w:rPr>
-        <w:t>Inspecting the confusion matrices at this threshold reveals a striking property: across the brand, Fanta, XL, Coca and Cappy classifiers there is not a single confusion between one class and another in the entire test set. Every error is an abstention — the model failed to reach the threshold and stayed silent — rather than a misclassification. In the brand layer, for instance: 47 instances, 39 correct, 8 abstentions, zero confusions.</w:t>
-      </w:r>
-    </w:p>
-    <w:p>
-      <w:pPr>
-        <w:keepNext w:val="0"/>
-        <w:spacing w:after="160" w:before="0" w:line="348" w:lineRule="auto"/>
-        <w:jc w:val="both"/>
-      </w:pPr>
-      <w:r>
-        <w:rPr>
-          <w:rFonts w:ascii="Times New Roman" w:hAnsi="Times New Roman" w:cs="Times New Roman"/>
-          <w:b w:val="0"/>
-          <w:i w:val="0"/>
-          <w:color w:val="111111"/>
-          <w:sz w:val="23"/>
-          <w:szCs w:val="23"/>
-        </w:rPr>
-        <w:t>This property has direct operational value: the system does not call a Coca-Cola a Sprite; it is either right or silent. An abstention is a tractable error, referred to human review and corrected there, whereas a confident misclassification propagates into the report without arousing suspicion. The sole exception is the packaging classifier, the only one that shows genuine confusion (can with plastic eight times, glass to plastic twice) and never abstains — and also the only one operating on a physical property rather than a commercial identity.</w:t>
+        <w:t>Both averages are valid, but they answer different questions. The per-class average asks “how does the system handle the average class?”, exposing and penalising data gaps; the per-instance average asks “how does it handle the average product on a shelf?”, which is what a client actually experiences. The prose of this study reports the former because it is the more conservative, and the latter is shown alongside it so the former is not misread.</w:t>
       </w:r>
     </w:p>
     <w:p>
@@ -7523,7 +5821,7 @@
           <w:sz w:val="23"/>
           <w:szCs w:val="23"/>
         </w:rPr>
-        <w:t>The conclusion is that no measured weakness in the system is attributable to the architecture or the choice of model; all of them trace back to specific, measurable data scarcity. This is a decisive practical distinction: data scarcity is addressed by targeted collection of known cost, whereas an architectural deficiency requires redesign.</w:t>
+        <w:t>The conclusion is that no measured weakness in the system is attributable to the architecture or the choice of model; all of them trace back to a specific, countable sample shortfall — and Section 9 separates which of these are genuine data scarcity and which are merely split artefacts. This is a decisive practical distinction: either kind is addressed by a procedure of known cost, whereas an architectural deficiency requires redesign.</w:t>
       </w:r>
     </w:p>
     <w:p>
@@ -7565,339 +5863,21 @@
     </w:p>
     <w:p>
       <w:pPr>
-        <w:keepNext/>
-        <w:spacing w:before="240" w:after="100"/>
-        <w:jc w:val="center"/>
+        <w:keepNext w:val="0"/>
+        <w:spacing w:after="160" w:before="0" w:line="348" w:lineRule="auto"/>
+        <w:jc w:val="both"/>
       </w:pPr>
       <w:r>
         <w:rPr>
           <w:rFonts w:ascii="Times New Roman" w:hAnsi="Times New Roman" w:cs="Times New Roman"/>
-          <w:b/>
-          <w:bCs w:val="1"/>
+          <w:b w:val="0"/>
           <w:i w:val="0"/>
-          <w:color w:val="555555"/>
-          <w:sz w:val="19"/>
-          <w:szCs w:val="19"/>
+          <w:color w:val="111111"/>
+          <w:sz w:val="23"/>
+          <w:szCs w:val="23"/>
         </w:rPr>
-        <w:t xml:space="preserve">Table 9. </w:t>
+        <w:t>The direct measurement — running both versions back to back on the same photograph through the same call path — showed processing time falling from 40.32 seconds to 14.20 seconds, a 65% reduction, with all sixty labels literally identical between the two runs on that photograph. The agreement is an acceptance condition rather than a detail: a speed-up that changes the result is a defect, not an improvement. The measurement is stated at its actual limits — one test photograph, taken when only a single classifier was connected — not as a general guarantee.</w:t>
       </w:r>
-      <w:r>
-        <w:rPr>
-          <w:rFonts w:ascii="Times New Roman" w:hAnsi="Times New Roman" w:cs="Times New Roman"/>
-          <w:b w:val="0"/>
-          <w:i/>
-          <w:iCs w:val="1"/>
-          <w:color w:val="555555"/>
-          <w:sz w:val="19"/>
-          <w:szCs w:val="19"/>
-        </w:rPr>
-        <w:t>Direct measurement, running both versions back to back on the same photograph through the same call path.</w:t>
-      </w:r>
-    </w:p>
-    <w:tbl>
-      <w:tblPr>
-        <w:tblStyle w:val="TableGrid"/>
-        <w:tblW w:type="auto" w:w="0"/>
-        <w:jc w:val="left"/>
-        <w:tblLook w:firstColumn="1" w:firstRow="1" w:lastColumn="0" w:lastRow="0" w:noHBand="0" w:noVBand="1" w:val="04A0"/>
-      </w:tblPr>
-      <w:tblGrid>
-        <w:gridCol w:w="2986"/>
-        <w:gridCol w:w="2986"/>
-        <w:gridCol w:w="2986"/>
-      </w:tblGrid>
-      <w:tr>
-        <w:tc>
-          <w:tcPr>
-            <w:tcW w:type="dxa" w:w="2986"/>
-          </w:tcPr>
-          <w:p>
-            <w:pPr>
-              <w:spacing w:before="60" w:after="60"/>
-              <w:jc w:val="left"/>
-            </w:pPr>
-            <w:r/>
-            <w:r>
-              <w:rPr>
-                <w:rFonts w:ascii="Times New Roman" w:hAnsi="Times New Roman" w:cs="Times New Roman"/>
-                <w:b/>
-                <w:bCs w:val="1"/>
-                <w:i w:val="0"/>
-                <w:color w:val="111111"/>
-                <w:sz w:val="20"/>
-                <w:szCs w:val="20"/>
-              </w:rPr>
-              <w:t>Item</w:t>
-            </w:r>
-          </w:p>
-        </w:tc>
-        <w:tc>
-          <w:tcPr>
-            <w:tcW w:type="dxa" w:w="2986"/>
-          </w:tcPr>
-          <w:p>
-            <w:pPr>
-              <w:spacing w:before="60" w:after="60"/>
-              <w:jc w:val="left"/>
-            </w:pPr>
-            <w:r/>
-            <w:r>
-              <w:rPr>
-                <w:rFonts w:ascii="Times New Roman" w:hAnsi="Times New Roman" w:cs="Times New Roman"/>
-                <w:b/>
-                <w:bCs w:val="1"/>
-                <w:i w:val="0"/>
-                <w:color w:val="111111"/>
-                <w:sz w:val="20"/>
-                <w:szCs w:val="20"/>
-              </w:rPr>
-              <w:t>Unrouted</w:t>
-            </w:r>
-          </w:p>
-        </w:tc>
-        <w:tc>
-          <w:tcPr>
-            <w:tcW w:type="dxa" w:w="2986"/>
-          </w:tcPr>
-          <w:p>
-            <w:pPr>
-              <w:spacing w:before="60" w:after="60"/>
-              <w:jc w:val="left"/>
-            </w:pPr>
-            <w:r/>
-            <w:r>
-              <w:rPr>
-                <w:rFonts w:ascii="Times New Roman" w:hAnsi="Times New Roman" w:cs="Times New Roman"/>
-                <w:b/>
-                <w:bCs w:val="1"/>
-                <w:i w:val="0"/>
-                <w:color w:val="111111"/>
-                <w:sz w:val="20"/>
-                <w:szCs w:val="20"/>
-              </w:rPr>
-              <w:t>Routed</w:t>
-            </w:r>
-          </w:p>
-        </w:tc>
-      </w:tr>
-      <w:tr>
-        <w:tc>
-          <w:tcPr>
-            <w:tcW w:type="dxa" w:w="2986"/>
-          </w:tcPr>
-          <w:p>
-            <w:pPr>
-              <w:spacing w:before="60" w:after="60"/>
-              <w:jc w:val="left"/>
-            </w:pPr>
-            <w:r/>
-            <w:r>
-              <w:rPr>
-                <w:rFonts w:ascii="Times New Roman" w:hAnsi="Times New Roman" w:cs="Times New Roman"/>
-                <w:b w:val="0"/>
-                <w:i w:val="0"/>
-                <w:color w:val="111111"/>
-                <w:sz w:val="20"/>
-                <w:szCs w:val="20"/>
-              </w:rPr>
-              <w:t>Processing time</w:t>
-            </w:r>
-          </w:p>
-        </w:tc>
-        <w:tc>
-          <w:tcPr>
-            <w:tcW w:type="dxa" w:w="2986"/>
-          </w:tcPr>
-          <w:p>
-            <w:pPr>
-              <w:spacing w:before="60" w:after="60"/>
-              <w:jc w:val="left"/>
-            </w:pPr>
-            <w:r/>
-            <w:r>
-              <w:rPr>
-                <w:rFonts w:ascii="Times New Roman" w:hAnsi="Times New Roman" w:cs="Times New Roman"/>
-                <w:b w:val="0"/>
-                <w:i w:val="0"/>
-                <w:color w:val="111111"/>
-                <w:sz w:val="20"/>
-                <w:szCs w:val="20"/>
-              </w:rPr>
-              <w:t>40.32 s</w:t>
-            </w:r>
-          </w:p>
-        </w:tc>
-        <w:tc>
-          <w:tcPr>
-            <w:tcW w:type="dxa" w:w="2986"/>
-          </w:tcPr>
-          <w:p>
-            <w:pPr>
-              <w:spacing w:before="60" w:after="60"/>
-              <w:jc w:val="left"/>
-            </w:pPr>
-            <w:r/>
-            <w:r>
-              <w:rPr>
-                <w:rFonts w:ascii="Times New Roman" w:hAnsi="Times New Roman" w:cs="Times New Roman"/>
-                <w:b w:val="0"/>
-                <w:i w:val="0"/>
-                <w:color w:val="111111"/>
-                <w:sz w:val="20"/>
-                <w:szCs w:val="20"/>
-              </w:rPr>
-              <w:t>14.20 s</w:t>
-            </w:r>
-          </w:p>
-        </w:tc>
-      </w:tr>
-      <w:tr>
-        <w:tc>
-          <w:tcPr>
-            <w:tcW w:type="dxa" w:w="2986"/>
-          </w:tcPr>
-          <w:p>
-            <w:pPr>
-              <w:spacing w:before="60" w:after="60"/>
-              <w:jc w:val="left"/>
-            </w:pPr>
-            <w:r/>
-            <w:r>
-              <w:rPr>
-                <w:rFonts w:ascii="Times New Roman" w:hAnsi="Times New Roman" w:cs="Times New Roman"/>
-                <w:b w:val="0"/>
-                <w:i w:val="0"/>
-                <w:color w:val="111111"/>
-                <w:sz w:val="20"/>
-                <w:szCs w:val="20"/>
-              </w:rPr>
-              <w:t>Reduction</w:t>
-            </w:r>
-          </w:p>
-        </w:tc>
-        <w:tc>
-          <w:tcPr>
-            <w:tcW w:type="dxa" w:w="2986"/>
-          </w:tcPr>
-          <w:p>
-            <w:pPr>
-              <w:spacing w:before="60" w:after="60"/>
-              <w:jc w:val="left"/>
-            </w:pPr>
-            <w:r/>
-            <w:r>
-              <w:rPr>
-                <w:rFonts w:ascii="Times New Roman" w:hAnsi="Times New Roman" w:cs="Times New Roman"/>
-                <w:b w:val="0"/>
-                <w:i w:val="0"/>
-                <w:color w:val="111111"/>
-                <w:sz w:val="20"/>
-                <w:szCs w:val="20"/>
-              </w:rPr>
-              <w:t>—</w:t>
-            </w:r>
-          </w:p>
-        </w:tc>
-        <w:tc>
-          <w:tcPr>
-            <w:tcW w:type="dxa" w:w="2986"/>
-          </w:tcPr>
-          <w:p>
-            <w:pPr>
-              <w:spacing w:before="60" w:after="60"/>
-              <w:jc w:val="left"/>
-            </w:pPr>
-            <w:r/>
-            <w:r>
-              <w:rPr>
-                <w:rFonts w:ascii="Times New Roman" w:hAnsi="Times New Roman" w:cs="Times New Roman"/>
-                <w:b w:val="0"/>
-                <w:i w:val="0"/>
-                <w:color w:val="111111"/>
-                <w:sz w:val="20"/>
-                <w:szCs w:val="20"/>
-              </w:rPr>
-              <w:t>65% (26.1 s)</w:t>
-            </w:r>
-          </w:p>
-        </w:tc>
-      </w:tr>
-      <w:tr>
-        <w:tc>
-          <w:tcPr>
-            <w:tcW w:type="dxa" w:w="2986"/>
-          </w:tcPr>
-          <w:p>
-            <w:pPr>
-              <w:spacing w:before="60" w:after="60"/>
-              <w:jc w:val="left"/>
-            </w:pPr>
-            <w:r/>
-            <w:r>
-              <w:rPr>
-                <w:rFonts w:ascii="Times New Roman" w:hAnsi="Times New Roman" w:cs="Times New Roman"/>
-                <w:b w:val="0"/>
-                <w:i w:val="0"/>
-                <w:color w:val="111111"/>
-                <w:sz w:val="20"/>
-                <w:szCs w:val="20"/>
-              </w:rPr>
-              <w:t>Output agreement</w:t>
-            </w:r>
-          </w:p>
-        </w:tc>
-        <w:tc>
-          <w:tcPr>
-            <w:tcW w:type="dxa" w:w="2986"/>
-          </w:tcPr>
-          <w:p>
-            <w:pPr>
-              <w:spacing w:before="60" w:after="60"/>
-              <w:jc w:val="left"/>
-            </w:pPr>
-            <w:r/>
-            <w:r>
-              <w:rPr>
-                <w:rFonts w:ascii="Times New Roman" w:hAnsi="Times New Roman" w:cs="Times New Roman"/>
-                <w:b w:val="0"/>
-                <w:i w:val="0"/>
-                <w:color w:val="111111"/>
-                <w:sz w:val="20"/>
-                <w:szCs w:val="20"/>
-              </w:rPr>
-              <w:t>—</w:t>
-            </w:r>
-          </w:p>
-        </w:tc>
-        <w:tc>
-          <w:tcPr>
-            <w:tcW w:type="dxa" w:w="2986"/>
-          </w:tcPr>
-          <w:p>
-            <w:pPr>
-              <w:spacing w:before="60" w:after="60"/>
-              <w:jc w:val="left"/>
-            </w:pPr>
-            <w:r/>
-            <w:r>
-              <w:rPr>
-                <w:rFonts w:ascii="Times New Roman" w:hAnsi="Times New Roman" w:cs="Times New Roman"/>
-                <w:b w:val="0"/>
-                <w:i w:val="0"/>
-                <w:color w:val="111111"/>
-                <w:sz w:val="20"/>
-                <w:szCs w:val="20"/>
-              </w:rPr>
-              <w:t>identical</w:t>
-            </w:r>
-          </w:p>
-        </w:tc>
-      </w:tr>
-    </w:tbl>
-    <w:p>
-      <w:pPr>
-        <w:spacing w:after="200" w:before="0"/>
-      </w:pPr>
     </w:p>
     <w:p>
       <w:pPr>
@@ -7914,7 +5894,7 @@
           <w:sz w:val="23"/>
           <w:szCs w:val="23"/>
         </w:rPr>
-        <w:t>Identical output is an essential condition rather than a detail: a speed-up that changes the result is a defect, not an improvement.</w:t>
+        <w:t>Routing, however, is today no longer merely a performance optimisation but a correctness requirement. Once every classifier was set to always return its top-1 guess (Section 7 explains why), each variant classifier produces an answer for any region it receives — so running all four classifiers unrouted would let the merge step pick up the Fanta classifier's guess on a Sprite crop. The unrouted design is no longer a slower alternative; it is a wrong one.</w:t>
       </w:r>
     </w:p>
     <w:p>
@@ -8059,7 +6039,7 @@
           <w:sz w:val="19"/>
           <w:szCs w:val="19"/>
         </w:rPr>
-        <w:t xml:space="preserve">Table 10. </w:t>
+        <w:t xml:space="preserve">Table 8. </w:t>
       </w:r>
       <w:r>
         <w:rPr>
@@ -9168,7 +7148,7 @@
           <w:sz w:val="19"/>
           <w:szCs w:val="19"/>
         </w:rPr>
-        <w:t xml:space="preserve">Table 11. </w:t>
+        <w:t xml:space="preserve">Table 9. </w:t>
       </w:r>
       <w:r>
         <w:rPr>
@@ -10060,61 +8040,7 @@
           <w:sz w:val="23"/>
           <w:szCs w:val="23"/>
         </w:rPr>
-        <w:t>2. From this follows an essential distinction between two kinds of weakness that had been conflated under the single description of “data scarcity”:</w:t>
-      </w:r>
-    </w:p>
-    <w:p>
-      <w:pPr>
-        <w:keepNext w:val="0"/>
-        <w:spacing w:after="160" w:before="0" w:line="348" w:lineRule="auto"/>
-        <w:jc w:val="both"/>
-      </w:pPr>
-      <w:r>
-        <w:rPr>
-          <w:rFonts w:ascii="Times New Roman" w:hAnsi="Times New Roman" w:cs="Times New Roman"/>
-          <w:b w:val="0"/>
-          <w:i w:val="0"/>
-          <w:color w:val="111111"/>
-          <w:sz w:val="23"/>
-          <w:szCs w:val="23"/>
-        </w:rPr>
-        <w:t>The first is a split deficiency rather than a data one: sprite, fanta at brand level, xl-red. The data exists in full within the project, but the split withheld it from the test set. The remedy needs no photography and no new data — only regenerating a version with a balanced split and retraining, a matter of minutes of computation, currently blocked solely on the availability of training credits.</w:t>
-      </w:r>
-    </w:p>
-    <w:p>
-      <w:pPr>
-        <w:keepNext w:val="0"/>
-        <w:spacing w:after="160" w:before="0" w:line="348" w:lineRule="auto"/>
-        <w:jc w:val="both"/>
-      </w:pPr>
-      <w:r>
-        <w:rPr>
-          <w:rFonts w:ascii="Times New Roman" w:hAnsi="Times New Roman" w:cs="Times New Roman"/>
-          <w:b w:val="0"/>
-          <w:i w:val="0"/>
-          <w:color w:val="111111"/>
-          <w:sz w:val="23"/>
-          <w:szCs w:val="23"/>
-        </w:rPr>
-        <w:t>The second is genuine data scarcity: coca-diet (5 source images), glass (25 images in the whole corpus, 3 of them in test), the thin Cappy flavours, and pepsi (unrepresented in both the detector and the classifier). No split and no retraining produces these; only field photography does.</w:t>
-      </w:r>
-    </w:p>
-    <w:p>
-      <w:pPr>
-        <w:keepNext w:val="0"/>
-        <w:spacing w:after="160" w:before="0" w:line="348" w:lineRule="auto"/>
-        <w:jc w:val="both"/>
-      </w:pPr>
-      <w:r>
-        <w:rPr>
-          <w:rFonts w:ascii="Times New Roman" w:hAnsi="Times New Roman" w:cs="Times New Roman"/>
-          <w:b w:val="0"/>
-          <w:i w:val="0"/>
-          <w:color w:val="111111"/>
-          <w:sz w:val="23"/>
-          <w:szCs w:val="23"/>
-        </w:rPr>
-        <w:t>Conflating the two inflates the apparent size of the work outstanding: a substantial part of what looks like a data gap is in fact a procedural one, closable by a single retraining run.</w:t>
+        <w:t>2. From this follows an essential distinction between two kinds of weakness that had been conflated under the single description of “data scarcity”. The first is a split deficiency rather than a data one (sprite, fanta at brand level, xl-red): the data exists in full within the project but the split withheld it from the test set, and the remedy is regenerating a version with a balanced split and retraining — minutes of computation, blocked solely on training credits. The second is genuine scarcity (coca-diet with 5 source images, glass with 25 images in the whole corpus, the thin Cappy flavours, and pepsi, unrepresented in detector and classifier alike): no split and no retraining produces these — only field photography does. Conflating the two inflates the apparent size of the work outstanding, since a substantial part of what looks like a data gap is a procedural one, closable by a single retraining run.</w:t>
       </w:r>
     </w:p>
     <w:p>
@@ -10186,7 +8112,7 @@
           <w:sz w:val="23"/>
           <w:szCs w:val="23"/>
         </w:rPr>
-        <w:t>“End to end” means treating the whole system as a single black box: it is given a shelf photograph it has never seen, and its final output — the complete compound label for every product — is compared against a human labelling of that same photograph. What Section 5 measured is the performance of each layer in isolation, which is a different thing.</w:t>
+        <w:t>“End to end” means treating the whole system as a single black box: it is given a shelf photograph it has never seen, and its final output — the complete compound label for every product — is compared against a human labelling of the same photograph; Section 5 instead measured each layer in isolation. The difference matters for two reasons: the accuracy of a chain is a product rather than an average (three steps at 90% each yield roughly 73%), and each layer was measured on clean, manually labelled input while in production it receives the previous layer's output — a crop that may be shifted, clipped, or occluded. The brand layer's 100% answers “how often is it right on ideal crops?”, not “how often is it right on our detector's crops?”.</w:t>
       </w:r>
     </w:p>
     <w:p>
@@ -10204,25 +8130,7 @@
           <w:sz w:val="23"/>
           <w:szCs w:val="23"/>
         </w:rPr>
-        <w:t>The difference matters for two reasons. First, the accuracy of a chain is a product rather than an average: for a bottle to reach its correct label the detector must find it, then the brand layer must be right, then the variant classifier must be right — and three steps at 90% each yield roughly 73%, not 90%. Second, and more subtly, each layer was measured on clean, manually labelled input, whereas in production it receives the previous layer's output: a crop that may be shifted, clipped at the edge, or partly occluded. The brand layer's 100% answers the question “how often is it right on ideal crops?”, not “how often is it right on our detector's crops?”.</w:t>
-      </w:r>
-    </w:p>
-    <w:p>
-      <w:pPr>
-        <w:keepNext w:val="0"/>
-        <w:spacing w:after="160" w:before="0" w:line="348" w:lineRule="auto"/>
-        <w:jc w:val="both"/>
-      </w:pPr>
-      <w:r>
-        <w:rPr>
-          <w:rFonts w:ascii="Times New Roman" w:hAnsi="Times New Roman" w:cs="Times New Roman"/>
-          <w:b w:val="0"/>
-          <w:i w:val="0"/>
-          <w:color w:val="111111"/>
-          <w:sz w:val="23"/>
-          <w:szCs w:val="23"/>
-        </w:rPr>
-        <w:t>The distinction is practical rather than theoretical: the only figure that may honestly be given to a client is the end-to-end one, and it will necessarily be lower than every figure in Section 5. The cost of closing this gap is not computational but human — fully labelling thirty to fifty shelf photographs by hand, with no training and no credits required.</w:t>
+        <w:t>The distinction is practical rather than theoretical: the only figure that may honestly be given to a client is the end-to-end one, and it will necessarily be lower than every figure in Section 5. The cost of closing the gap is human rather than computational — fully labelling thirty to fifty shelf photographs by hand, with no training and no credits required.</w:t>
       </w:r>
     </w:p>
     <w:p>
@@ -10296,25 +8204,7 @@
           <w:sz w:val="23"/>
           <w:szCs w:val="23"/>
         </w:rPr>
-        <w:t>Next, an end-to-end evaluation on a manually labelled test set, to measure error accumulation across the chain (Limitation 5) — scientifically the highest-priority item, and one that needs no credits at all. Then re-evaluating both detectors under a unified preprocessing pipeline, to close Limitation 3. Then harvesting the first batch of active-learning data, reviewing it, and retraining on it — the first practical test of whether the loop described in Section 6 closes.</w:t>
-      </w:r>
-    </w:p>
-    <w:p>
-      <w:pPr>
-        <w:keepNext w:val="0"/>
-        <w:spacing w:after="160" w:before="0" w:line="348" w:lineRule="auto"/>
-        <w:jc w:val="both"/>
-      </w:pPr>
-      <w:r>
-        <w:rPr>
-          <w:rFonts w:ascii="Times New Roman" w:hAnsi="Times New Roman" w:cs="Times New Roman"/>
-          <w:b w:val="0"/>
-          <w:i w:val="0"/>
-          <w:color w:val="111111"/>
-          <w:sz w:val="23"/>
-          <w:szCs w:val="23"/>
-        </w:rPr>
-        <w:t>Throughout the above, a stratified split guaranteeing each class a minimum test share is preferable to the random splitting that produced the situation described in Limitation 1 — because randomness applied to an unbalanced set leaves small classes unrepresented by probability alone.</w:t>
+        <w:t>Next, an end-to-end evaluation on a manually labelled test set, to measure error accumulation across the chain (Limitation 5) — scientifically the highest-priority item, and one that needs no credits at all. Then re-evaluating both detectors under a unified preprocessing pipeline, to close Limitation 3. Then harvesting the first batch of active-learning data, reviewing it, and retraining on it — the first practical test of whether the loop described in Section 6 closes. Every future split should be stratified, guaranteeing each class a minimum test share — randomness applied to an unbalanced set is what produced the situation of Limitation 1 in the first place.</w:t>
       </w:r>
     </w:p>
     <w:p>
@@ -10369,25 +8259,7 @@
           <w:sz w:val="23"/>
           <w:szCs w:val="23"/>
         </w:rPr>
-        <w:t>The first step is not technical but investigative: establishing whether size is ambiguous in this market at all — since many combinations (brand + variant + package type) may be sold in only one size, in which case size can be looked up from a reference table rather than inferred visually. This is a cheap step that may eliminate most of the hard cases before anything is built.</w:t>
-      </w:r>
-    </w:p>
-    <w:p>
-      <w:pPr>
-        <w:keepNext w:val="0"/>
-        <w:spacing w:after="160" w:before="0" w:line="348" w:lineRule="auto"/>
-        <w:jc w:val="both"/>
-      </w:pPr>
-      <w:r>
-        <w:rPr>
-          <w:rFonts w:ascii="Times New Roman" w:hAnsi="Times New Roman" w:cs="Times New Roman"/>
-          <w:b w:val="0"/>
-          <w:i w:val="0"/>
-          <w:color w:val="111111"/>
-          <w:sz w:val="23"/>
-          <w:szCs w:val="23"/>
-        </w:rPr>
-        <w:t>For the ambiguous cases that remain, the candidate approach is geometric comparison against a reference object of known size in the same image, falling back to a visual size classifier if the former proves inadequate. Both require a validation set before they can be trusted.</w:t>
+        <w:t>The first step is not technical but investigative: establishing whether size is ambiguous in this market at all — since many combinations (brand + variant + package type) may be sold in only one size, in which case size can be looked up from a reference table rather than inferred visually, a cheap step that may eliminate most of the hard cases before anything is built. For the ambiguous cases that remain, the candidate approach is geometric comparison against a reference object of known size in the same image, falling back to a visual size classifier if that proves inadequate — and either requires a validation set before it can be trusted.</w:t>
       </w:r>
     </w:p>
     <w:p>
@@ -10443,7 +8315,7 @@
           <w:sz w:val="19"/>
           <w:szCs w:val="19"/>
         </w:rPr>
-        <w:t xml:space="preserve">Table 12. </w:t>
+        <w:t xml:space="preserve">Table 10. </w:t>
       </w:r>
       <w:r>
         <w:rPr>
@@ -11118,7 +8990,7 @@
           <w:sz w:val="23"/>
           <w:szCs w:val="23"/>
         </w:rPr>
-        <w:t>Second, the shape of growth deserves measurement as much as accuracy does. The difference between O(N×K) and O(N) does not show up in a single image, but it determines whether the system remains practical after ten brands or collapses under its own weight.</w:t>
+        <w:t>Second, the shape of growth deserves measurement as much as accuracy does. The difference between O(N×K) and O(N) does not show up in a single image, but it determines whether the system remains practical after ten brands or collapses under its own weight. The marginal cost of catalogue expansion — roughly four minutes of GPU time, measured four times — is the practical translation of that gain, and is the commercially decisive metric rather than any individual model's accuracy.</w:t>
       </w:r>
     </w:p>
     <w:p>
@@ -11136,25 +9008,7 @@
           <w:sz w:val="23"/>
           <w:szCs w:val="23"/>
         </w:rPr>
-        <w:t>Third, the marginal cost of catalogue expansion — roughly four minutes of GPU time, measured four times — is the practical translation of the architectural gain, and is the commercially decisive metric rather than any individual model's accuracy.</w:t>
-      </w:r>
-    </w:p>
-    <w:p>
-      <w:pPr>
-        <w:keepNext w:val="0"/>
-        <w:spacing w:after="160" w:before="0" w:line="348" w:lineRule="auto"/>
-        <w:jc w:val="both"/>
-      </w:pPr>
-      <w:r>
-        <w:rPr>
-          <w:rFonts w:ascii="Times New Roman" w:hAnsi="Times New Roman" w:cs="Times New Roman"/>
-          <w:b w:val="0"/>
-          <w:i w:val="0"/>
-          <w:color w:val="111111"/>
-          <w:sz w:val="23"/>
-          <w:szCs w:val="23"/>
-        </w:rPr>
-        <w:t>Fourth, data quality bounds the ceiling of any architecture. This is now measured rather than inferred: every individual weakness traces to specific, countable data scarcity, and none traces to a flaw in the design. The most important item in the next phase is therefore not an engineering one at all, but a photography round.</w:t>
+        <w:t>Third, data quality — and the quality of its measurement — bounds the ceiling of any architecture. This is now measured rather than inferred: every individual weakness traces to a countable sample shortfall, part genuine photography scarcity and part a split artefact repairable by retraining, and none traces to a flaw in the design. The two most important items in the next phase are therefore fixing the splits and a photography round — not an engineering item.</w:t>
       </w:r>
     </w:p>
     <w:p>

</xml_diff>